<commit_message>
mi primer push con gemini
</commit_message>
<xml_diff>
--- a/ANTENAS Y PROPAGACIÓN/AAA CARATULEX PDF.docx
+++ b/ANTENAS Y PROPAGACIÓN/AAA CARATULEX PDF.docx
@@ -13,6 +13,73 @@
           <w:szCs w:val="28"/>
         </w:rPr>
       </w:pPr>
+      <w:r>
+        <w:rPr>
+          <w:noProof/>
+        </w:rPr>
+        <w:drawing>
+          <wp:anchor distT="0" distB="0" distL="114300" distR="114300" simplePos="0" relativeHeight="251659264" behindDoc="0" locked="0" layoutInCell="1" allowOverlap="1" wp14:anchorId="727A7DD8" wp14:editId="549DAF5A">
+            <wp:simplePos x="0" y="0"/>
+            <wp:positionH relativeFrom="column">
+              <wp:posOffset>4782185</wp:posOffset>
+            </wp:positionH>
+            <wp:positionV relativeFrom="paragraph">
+              <wp:posOffset>-279400</wp:posOffset>
+            </wp:positionV>
+            <wp:extent cx="1950720" cy="1463728"/>
+            <wp:effectExtent l="0" t="0" r="0" b="0"/>
+            <wp:wrapNone/>
+            <wp:docPr id="76131457" name="Imagen 1"/>
+            <wp:cNvGraphicFramePr>
+              <a:graphicFrameLocks xmlns:a="http://schemas.openxmlformats.org/drawingml/2006/main" noChangeAspect="1"/>
+            </wp:cNvGraphicFramePr>
+            <a:graphic xmlns:a="http://schemas.openxmlformats.org/drawingml/2006/main">
+              <a:graphicData uri="http://schemas.openxmlformats.org/drawingml/2006/picture">
+                <pic:pic xmlns:pic="http://schemas.openxmlformats.org/drawingml/2006/picture">
+                  <pic:nvPicPr>
+                    <pic:cNvPr id="0" name="Picture 1"/>
+                    <pic:cNvPicPr>
+                      <a:picLocks noChangeAspect="1" noChangeArrowheads="1"/>
+                    </pic:cNvPicPr>
+                  </pic:nvPicPr>
+                  <pic:blipFill>
+                    <a:blip r:embed="rId9" cstate="print">
+                      <a:extLst>
+                        <a:ext uri="{28A0092B-C50C-407E-A947-70E740481C1C}">
+                          <a14:useLocalDpi xmlns:a14="http://schemas.microsoft.com/office/drawing/2010/main" val="0"/>
+                        </a:ext>
+                      </a:extLst>
+                    </a:blip>
+                    <a:srcRect/>
+                    <a:stretch>
+                      <a:fillRect/>
+                    </a:stretch>
+                  </pic:blipFill>
+                  <pic:spPr bwMode="auto">
+                    <a:xfrm>
+                      <a:off x="0" y="0"/>
+                      <a:ext cx="1950720" cy="1463728"/>
+                    </a:xfrm>
+                    <a:prstGeom prst="rect">
+                      <a:avLst/>
+                    </a:prstGeom>
+                    <a:noFill/>
+                    <a:ln>
+                      <a:noFill/>
+                    </a:ln>
+                  </pic:spPr>
+                </pic:pic>
+              </a:graphicData>
+            </a:graphic>
+            <wp14:sizeRelH relativeFrom="margin">
+              <wp14:pctWidth>0</wp14:pctWidth>
+            </wp14:sizeRelH>
+            <wp14:sizeRelV relativeFrom="margin">
+              <wp14:pctHeight>0</wp14:pctHeight>
+            </wp14:sizeRelV>
+          </wp:anchor>
+        </w:drawing>
+      </w:r>
       <w:r>
         <w:rPr>
           <w:b/>
@@ -22,13 +89,13 @@
           <w:szCs w:val="24"/>
         </w:rPr>
         <w:drawing>
-          <wp:anchor distT="0" distB="0" distL="114300" distR="114300" simplePos="0" relativeHeight="251658240" behindDoc="0" locked="0" layoutInCell="1" allowOverlap="1" wp14:anchorId="5424E25D" wp14:editId="545CFDD0">
+          <wp:anchor distT="0" distB="0" distL="114300" distR="114300" simplePos="0" relativeHeight="251658240" behindDoc="0" locked="0" layoutInCell="1" allowOverlap="1" wp14:anchorId="5424E25D" wp14:editId="0D8E6B33">
             <wp:simplePos x="0" y="0"/>
             <wp:positionH relativeFrom="margin">
-              <wp:posOffset>-559435</wp:posOffset>
+              <wp:posOffset>-666115</wp:posOffset>
             </wp:positionH>
             <wp:positionV relativeFrom="paragraph">
-              <wp:posOffset>-118745</wp:posOffset>
+              <wp:posOffset>-131445</wp:posOffset>
             </wp:positionV>
             <wp:extent cx="996950" cy="1123950"/>
             <wp:effectExtent l="0" t="0" r="0" b="0"/>
@@ -47,7 +114,7 @@
                     </pic:cNvPicPr>
                   </pic:nvPicPr>
                   <pic:blipFill rotWithShape="1">
-                    <a:blip r:embed="rId8" cstate="print">
+                    <a:blip r:embed="rId10" cstate="print">
                       <a:extLst>
                         <a:ext uri="{28A0092B-C50C-407E-A947-70E740481C1C}">
                           <a14:useLocalDpi xmlns:a14="http://schemas.microsoft.com/office/drawing/2010/main" val="0"/>
@@ -91,80 +158,6 @@
         <w:rPr>
           <w:b/>
           <w:bCs/>
-          <w:noProof/>
-          <w:sz w:val="28"/>
-          <w:szCs w:val="24"/>
-        </w:rPr>
-        <w:drawing>
-          <wp:anchor distT="0" distB="0" distL="114300" distR="114300" simplePos="0" relativeHeight="251659264" behindDoc="0" locked="0" layoutInCell="1" allowOverlap="1" wp14:anchorId="1596AAE0" wp14:editId="29D81940">
-            <wp:simplePos x="0" y="0"/>
-            <wp:positionH relativeFrom="column">
-              <wp:posOffset>5003165</wp:posOffset>
-            </wp:positionH>
-            <wp:positionV relativeFrom="paragraph">
-              <wp:posOffset>-118745</wp:posOffset>
-            </wp:positionV>
-            <wp:extent cx="1110615" cy="1111250"/>
-            <wp:effectExtent l="0" t="0" r="0" b="0"/>
-            <wp:wrapNone/>
-            <wp:docPr id="1481480666" name="Imagen 1"/>
-            <wp:cNvGraphicFramePr>
-              <a:graphicFrameLocks xmlns:a="http://schemas.openxmlformats.org/drawingml/2006/main" noChangeAspect="1"/>
-            </wp:cNvGraphicFramePr>
-            <a:graphic xmlns:a="http://schemas.openxmlformats.org/drawingml/2006/main">
-              <a:graphicData uri="http://schemas.openxmlformats.org/drawingml/2006/picture">
-                <pic:pic xmlns:pic="http://schemas.openxmlformats.org/drawingml/2006/picture">
-                  <pic:nvPicPr>
-                    <pic:cNvPr id="0" name="Picture 1"/>
-                    <pic:cNvPicPr>
-                      <a:picLocks noChangeAspect="1" noChangeArrowheads="1"/>
-                    </pic:cNvPicPr>
-                  </pic:nvPicPr>
-                  <pic:blipFill rotWithShape="1">
-                    <a:blip r:embed="rId9">
-                      <a:extLst>
-                        <a:ext uri="{28A0092B-C50C-407E-A947-70E740481C1C}">
-                          <a14:useLocalDpi xmlns:a14="http://schemas.microsoft.com/office/drawing/2010/main" val="0"/>
-                        </a:ext>
-                      </a:extLst>
-                    </a:blip>
-                    <a:srcRect l="20634" t="12351" r="21158" b="10415"/>
-                    <a:stretch/>
-                  </pic:blipFill>
-                  <pic:spPr bwMode="auto">
-                    <a:xfrm>
-                      <a:off x="0" y="0"/>
-                      <a:ext cx="1110615" cy="1111250"/>
-                    </a:xfrm>
-                    <a:prstGeom prst="rect">
-                      <a:avLst/>
-                    </a:prstGeom>
-                    <a:noFill/>
-                    <a:ln>
-                      <a:noFill/>
-                    </a:ln>
-                    <a:extLst>
-                      <a:ext uri="{53640926-AAD7-44D8-BBD7-CCE9431645EC}">
-                        <a14:shadowObscured xmlns:a14="http://schemas.microsoft.com/office/drawing/2010/main"/>
-                      </a:ext>
-                    </a:extLst>
-                  </pic:spPr>
-                </pic:pic>
-              </a:graphicData>
-            </a:graphic>
-            <wp14:sizeRelH relativeFrom="margin">
-              <wp14:pctWidth>0</wp14:pctWidth>
-            </wp14:sizeRelH>
-            <wp14:sizeRelV relativeFrom="margin">
-              <wp14:pctHeight>0</wp14:pctHeight>
-            </wp14:sizeRelV>
-          </wp:anchor>
-        </w:drawing>
-      </w:r>
-      <w:r>
-        <w:rPr>
-          <w:b/>
-          <w:bCs/>
           <w:sz w:val="32"/>
           <w:szCs w:val="28"/>
         </w:rPr>
@@ -190,18 +183,14 @@
         <w:rPr>
           <w:b/>
           <w:bCs/>
-          <w:sz w:val="28"/>
-          <w:szCs w:val="24"/>
         </w:rPr>
       </w:pPr>
       <w:r>
         <w:rPr>
           <w:b/>
           <w:bCs/>
-          <w:sz w:val="28"/>
-          <w:szCs w:val="24"/>
         </w:rPr>
-        <w:t>FACULTAD DE CIENCIAS DE LA INGENIERÍA</w:t>
+        <w:t>FACULTAD DE CIENCIAS COMPUTACIONALES Y DISEÑO DIGITAL</w:t>
       </w:r>
     </w:p>
     <w:p>
@@ -211,16 +200,12 @@
         <w:rPr>
           <w:b/>
           <w:bCs/>
-          <w:sz w:val="28"/>
-          <w:szCs w:val="24"/>
         </w:rPr>
       </w:pPr>
       <w:r>
         <w:rPr>
           <w:b/>
           <w:bCs/>
-          <w:sz w:val="28"/>
-          <w:szCs w:val="24"/>
         </w:rPr>
         <w:t>INGENIERÍA TELEMÁTICA</w:t>
       </w:r>
@@ -281,14 +266,6 @@
     <w:p>
       <w:pPr>
         <w:jc w:val="center"/>
-      </w:pPr>
-      <w:r>
-        <w:t>ANTENAS Y PROPAGACIÓN</w:t>
-      </w:r>
-    </w:p>
-    <w:p>
-      <w:pPr>
-        <w:jc w:val="center"/>
         <w:rPr>
           <w:b/>
           <w:bCs/>
@@ -296,6 +273,9 @@
           <w:szCs w:val="24"/>
         </w:rPr>
       </w:pPr>
+      <w:r>
+        <w:t>ANTENAS Y PROPAGACIÓN</w:t>
+      </w:r>
     </w:p>
     <w:p>
       <w:pPr>
@@ -512,14 +492,16 @@
     </w:p>
     <w:p>
       <w:r>
-        <w:t>QUEVEDO, ECUADOR                                                                     5 DE JUL. DE 2025</w:t>
+        <w:t xml:space="preserve">QUEVEDO, ECUADOR                                                                     </w:t>
+      </w:r>
+      <w:r>
+        <w:t>17</w:t>
+      </w:r>
+      <w:r>
+        <w:t xml:space="preserve"> DE AGO. DE 25</w:t>
       </w:r>
     </w:p>
-    <w:p>
-      <w:pPr>
-        <w:pStyle w:val="Ttulo1"/>
-      </w:pPr>
-    </w:p>
+    <w:p/>
     <w:sectPr>
       <w:pgSz w:w="11906" w:h="16838"/>
       <w:pgMar w:top="1417" w:right="1701" w:bottom="1417" w:left="1701" w:header="708" w:footer="708" w:gutter="0"/>
@@ -528,6 +510,2031 @@
     </w:sectPr>
   </w:body>
 </w:document>
+</file>
+
+<file path=word/numbering.xml><?xml version="1.0" encoding="utf-8"?>
+<w:numbering xmlns:wpc="http://schemas.microsoft.com/office/word/2010/wordprocessingCanvas" xmlns:cx="http://schemas.microsoft.com/office/drawing/2014/chartex" xmlns:cx1="http://schemas.microsoft.com/office/drawing/2015/9/8/chartex" xmlns:cx2="http://schemas.microsoft.com/office/drawing/2015/10/21/chartex" xmlns:cx3="http://schemas.microsoft.com/office/drawing/2016/5/9/chartex" xmlns:cx4="http://schemas.microsoft.com/office/drawing/2016/5/10/chartex" xmlns:cx5="http://schemas.microsoft.com/office/drawing/2016/5/11/chartex" xmlns:cx6="http://schemas.microsoft.com/office/drawing/2016/5/12/chartex" xmlns:cx7="http://schemas.microsoft.com/office/drawing/2016/5/13/chartex" xmlns:cx8="http://schemas.microsoft.com/office/drawing/2016/5/14/chartex" xmlns:mc="http://schemas.openxmlformats.org/markup-compatibility/2006" xmlns:aink="http://schemas.microsoft.com/office/drawing/2016/ink" xmlns:am3d="http://schemas.microsoft.com/office/drawing/2017/model3d" xmlns:o="urn:schemas-microsoft-com:office:office" xmlns:oel="http://schemas.microsoft.com/office/2019/extlst" xmlns:r="http://schemas.openxmlformats.org/officeDocument/2006/relationships" xmlns:m="http://schemas.openxmlformats.org/officeDocument/2006/math" xmlns:v="urn:schemas-microsoft-com:vml" xmlns:wp14="http://schemas.microsoft.com/office/word/2010/wordprocessingDrawing" xmlns:wp="http://schemas.openxmlformats.org/drawingml/2006/wordprocessingDrawing" xmlns:w10="urn:schemas-microsoft-com:office:word" xmlns:w="http://schemas.openxmlformats.org/wordprocessingml/2006/main" xmlns:w14="http://schemas.microsoft.com/office/word/2010/wordml" xmlns:w15="http://schemas.microsoft.com/office/word/2012/wordml" xmlns:w16cex="http://schemas.microsoft.com/office/word/2018/wordml/cex" xmlns:w16cid="http://schemas.microsoft.com/office/word/2016/wordml/cid" xmlns:w16="http://schemas.microsoft.com/office/word/2018/wordml" xmlns:w16du="http://schemas.microsoft.com/office/word/2023/wordml/word16du" xmlns:w16sdtdh="http://schemas.microsoft.com/office/word/2020/wordml/sdtdatahash" xmlns:w16sdtfl="http://schemas.microsoft.com/office/word/2024/wordml/sdtformatlock" xmlns:w16se="http://schemas.microsoft.com/office/word/2015/wordml/symex" xmlns:wpg="http://schemas.microsoft.com/office/word/2010/wordprocessingGroup" xmlns:wpi="http://schemas.microsoft.com/office/word/2010/wordprocessingInk" xmlns:wne="http://schemas.microsoft.com/office/word/2006/wordml" xmlns:wps="http://schemas.microsoft.com/office/word/2010/wordprocessingShape" mc:Ignorable="w14 w15 w16se w16cid w16 w16cex w16sdtdh w16sdtfl w16du wp14">
+  <w:abstractNum w:abstractNumId="0" w15:restartNumberingAfterBreak="0">
+    <w:nsid w:val="02DD0C3C"/>
+    <w:multiLevelType w:val="multilevel"/>
+    <w:tmpl w:val="0B0AEDC6"/>
+    <w:lvl w:ilvl="0">
+      <w:start w:val="1"/>
+      <w:numFmt w:val="decimal"/>
+      <w:lvlText w:val="%1."/>
+      <w:lvlJc w:val="left"/>
+      <w:pPr>
+        <w:tabs>
+          <w:tab w:val="num" w:pos="720"/>
+        </w:tabs>
+        <w:ind w:left="720" w:hanging="360"/>
+      </w:pPr>
+    </w:lvl>
+    <w:lvl w:ilvl="1" w:tentative="1">
+      <w:start w:val="1"/>
+      <w:numFmt w:val="decimal"/>
+      <w:lvlText w:val="%2."/>
+      <w:lvlJc w:val="left"/>
+      <w:pPr>
+        <w:tabs>
+          <w:tab w:val="num" w:pos="1440"/>
+        </w:tabs>
+        <w:ind w:left="1440" w:hanging="360"/>
+      </w:pPr>
+    </w:lvl>
+    <w:lvl w:ilvl="2" w:tentative="1">
+      <w:start w:val="1"/>
+      <w:numFmt w:val="decimal"/>
+      <w:lvlText w:val="%3."/>
+      <w:lvlJc w:val="left"/>
+      <w:pPr>
+        <w:tabs>
+          <w:tab w:val="num" w:pos="2160"/>
+        </w:tabs>
+        <w:ind w:left="2160" w:hanging="360"/>
+      </w:pPr>
+    </w:lvl>
+    <w:lvl w:ilvl="3" w:tentative="1">
+      <w:start w:val="1"/>
+      <w:numFmt w:val="decimal"/>
+      <w:lvlText w:val="%4."/>
+      <w:lvlJc w:val="left"/>
+      <w:pPr>
+        <w:tabs>
+          <w:tab w:val="num" w:pos="2880"/>
+        </w:tabs>
+        <w:ind w:left="2880" w:hanging="360"/>
+      </w:pPr>
+    </w:lvl>
+    <w:lvl w:ilvl="4" w:tentative="1">
+      <w:start w:val="1"/>
+      <w:numFmt w:val="decimal"/>
+      <w:lvlText w:val="%5."/>
+      <w:lvlJc w:val="left"/>
+      <w:pPr>
+        <w:tabs>
+          <w:tab w:val="num" w:pos="3600"/>
+        </w:tabs>
+        <w:ind w:left="3600" w:hanging="360"/>
+      </w:pPr>
+    </w:lvl>
+    <w:lvl w:ilvl="5" w:tentative="1">
+      <w:start w:val="1"/>
+      <w:numFmt w:val="decimal"/>
+      <w:lvlText w:val="%6."/>
+      <w:lvlJc w:val="left"/>
+      <w:pPr>
+        <w:tabs>
+          <w:tab w:val="num" w:pos="4320"/>
+        </w:tabs>
+        <w:ind w:left="4320" w:hanging="360"/>
+      </w:pPr>
+    </w:lvl>
+    <w:lvl w:ilvl="6" w:tentative="1">
+      <w:start w:val="1"/>
+      <w:numFmt w:val="decimal"/>
+      <w:lvlText w:val="%7."/>
+      <w:lvlJc w:val="left"/>
+      <w:pPr>
+        <w:tabs>
+          <w:tab w:val="num" w:pos="5040"/>
+        </w:tabs>
+        <w:ind w:left="5040" w:hanging="360"/>
+      </w:pPr>
+    </w:lvl>
+    <w:lvl w:ilvl="7" w:tentative="1">
+      <w:start w:val="1"/>
+      <w:numFmt w:val="decimal"/>
+      <w:lvlText w:val="%8."/>
+      <w:lvlJc w:val="left"/>
+      <w:pPr>
+        <w:tabs>
+          <w:tab w:val="num" w:pos="5760"/>
+        </w:tabs>
+        <w:ind w:left="5760" w:hanging="360"/>
+      </w:pPr>
+    </w:lvl>
+    <w:lvl w:ilvl="8" w:tentative="1">
+      <w:start w:val="1"/>
+      <w:numFmt w:val="decimal"/>
+      <w:lvlText w:val="%9."/>
+      <w:lvlJc w:val="left"/>
+      <w:pPr>
+        <w:tabs>
+          <w:tab w:val="num" w:pos="6480"/>
+        </w:tabs>
+        <w:ind w:left="6480" w:hanging="360"/>
+      </w:pPr>
+    </w:lvl>
+  </w:abstractNum>
+  <w:abstractNum w:abstractNumId="1" w15:restartNumberingAfterBreak="0">
+    <w:nsid w:val="0CA714FA"/>
+    <w:multiLevelType w:val="multilevel"/>
+    <w:tmpl w:val="ECE81BB6"/>
+    <w:lvl w:ilvl="0">
+      <w:start w:val="1"/>
+      <w:numFmt w:val="bullet"/>
+      <w:lvlText w:val=""/>
+      <w:lvlJc w:val="left"/>
+      <w:pPr>
+        <w:tabs>
+          <w:tab w:val="num" w:pos="720"/>
+        </w:tabs>
+        <w:ind w:left="720" w:hanging="360"/>
+      </w:pPr>
+      <w:rPr>
+        <w:rFonts w:ascii="Symbol" w:hAnsi="Symbol" w:hint="default"/>
+        <w:sz w:val="20"/>
+      </w:rPr>
+    </w:lvl>
+    <w:lvl w:ilvl="1" w:tentative="1">
+      <w:start w:val="1"/>
+      <w:numFmt w:val="bullet"/>
+      <w:lvlText w:val="o"/>
+      <w:lvlJc w:val="left"/>
+      <w:pPr>
+        <w:tabs>
+          <w:tab w:val="num" w:pos="1440"/>
+        </w:tabs>
+        <w:ind w:left="1440" w:hanging="360"/>
+      </w:pPr>
+      <w:rPr>
+        <w:rFonts w:ascii="Courier New" w:hAnsi="Courier New" w:hint="default"/>
+        <w:sz w:val="20"/>
+      </w:rPr>
+    </w:lvl>
+    <w:lvl w:ilvl="2" w:tentative="1">
+      <w:start w:val="1"/>
+      <w:numFmt w:val="bullet"/>
+      <w:lvlText w:val=""/>
+      <w:lvlJc w:val="left"/>
+      <w:pPr>
+        <w:tabs>
+          <w:tab w:val="num" w:pos="2160"/>
+        </w:tabs>
+        <w:ind w:left="2160" w:hanging="360"/>
+      </w:pPr>
+      <w:rPr>
+        <w:rFonts w:ascii="Wingdings" w:hAnsi="Wingdings" w:hint="default"/>
+        <w:sz w:val="20"/>
+      </w:rPr>
+    </w:lvl>
+    <w:lvl w:ilvl="3" w:tentative="1">
+      <w:start w:val="1"/>
+      <w:numFmt w:val="bullet"/>
+      <w:lvlText w:val=""/>
+      <w:lvlJc w:val="left"/>
+      <w:pPr>
+        <w:tabs>
+          <w:tab w:val="num" w:pos="2880"/>
+        </w:tabs>
+        <w:ind w:left="2880" w:hanging="360"/>
+      </w:pPr>
+      <w:rPr>
+        <w:rFonts w:ascii="Wingdings" w:hAnsi="Wingdings" w:hint="default"/>
+        <w:sz w:val="20"/>
+      </w:rPr>
+    </w:lvl>
+    <w:lvl w:ilvl="4" w:tentative="1">
+      <w:start w:val="1"/>
+      <w:numFmt w:val="bullet"/>
+      <w:lvlText w:val=""/>
+      <w:lvlJc w:val="left"/>
+      <w:pPr>
+        <w:tabs>
+          <w:tab w:val="num" w:pos="3600"/>
+        </w:tabs>
+        <w:ind w:left="3600" w:hanging="360"/>
+      </w:pPr>
+      <w:rPr>
+        <w:rFonts w:ascii="Wingdings" w:hAnsi="Wingdings" w:hint="default"/>
+        <w:sz w:val="20"/>
+      </w:rPr>
+    </w:lvl>
+    <w:lvl w:ilvl="5" w:tentative="1">
+      <w:start w:val="1"/>
+      <w:numFmt w:val="bullet"/>
+      <w:lvlText w:val=""/>
+      <w:lvlJc w:val="left"/>
+      <w:pPr>
+        <w:tabs>
+          <w:tab w:val="num" w:pos="4320"/>
+        </w:tabs>
+        <w:ind w:left="4320" w:hanging="360"/>
+      </w:pPr>
+      <w:rPr>
+        <w:rFonts w:ascii="Wingdings" w:hAnsi="Wingdings" w:hint="default"/>
+        <w:sz w:val="20"/>
+      </w:rPr>
+    </w:lvl>
+    <w:lvl w:ilvl="6" w:tentative="1">
+      <w:start w:val="1"/>
+      <w:numFmt w:val="bullet"/>
+      <w:lvlText w:val=""/>
+      <w:lvlJc w:val="left"/>
+      <w:pPr>
+        <w:tabs>
+          <w:tab w:val="num" w:pos="5040"/>
+        </w:tabs>
+        <w:ind w:left="5040" w:hanging="360"/>
+      </w:pPr>
+      <w:rPr>
+        <w:rFonts w:ascii="Wingdings" w:hAnsi="Wingdings" w:hint="default"/>
+        <w:sz w:val="20"/>
+      </w:rPr>
+    </w:lvl>
+    <w:lvl w:ilvl="7" w:tentative="1">
+      <w:start w:val="1"/>
+      <w:numFmt w:val="bullet"/>
+      <w:lvlText w:val=""/>
+      <w:lvlJc w:val="left"/>
+      <w:pPr>
+        <w:tabs>
+          <w:tab w:val="num" w:pos="5760"/>
+        </w:tabs>
+        <w:ind w:left="5760" w:hanging="360"/>
+      </w:pPr>
+      <w:rPr>
+        <w:rFonts w:ascii="Wingdings" w:hAnsi="Wingdings" w:hint="default"/>
+        <w:sz w:val="20"/>
+      </w:rPr>
+    </w:lvl>
+    <w:lvl w:ilvl="8" w:tentative="1">
+      <w:start w:val="1"/>
+      <w:numFmt w:val="bullet"/>
+      <w:lvlText w:val=""/>
+      <w:lvlJc w:val="left"/>
+      <w:pPr>
+        <w:tabs>
+          <w:tab w:val="num" w:pos="6480"/>
+        </w:tabs>
+        <w:ind w:left="6480" w:hanging="360"/>
+      </w:pPr>
+      <w:rPr>
+        <w:rFonts w:ascii="Wingdings" w:hAnsi="Wingdings" w:hint="default"/>
+        <w:sz w:val="20"/>
+      </w:rPr>
+    </w:lvl>
+  </w:abstractNum>
+  <w:abstractNum w:abstractNumId="2" w15:restartNumberingAfterBreak="0">
+    <w:nsid w:val="10E83DC6"/>
+    <w:multiLevelType w:val="multilevel"/>
+    <w:tmpl w:val="1C30D6EA"/>
+    <w:lvl w:ilvl="0">
+      <w:start w:val="1"/>
+      <w:numFmt w:val="bullet"/>
+      <w:lvlText w:val=""/>
+      <w:lvlJc w:val="left"/>
+      <w:pPr>
+        <w:tabs>
+          <w:tab w:val="num" w:pos="720"/>
+        </w:tabs>
+        <w:ind w:left="720" w:hanging="360"/>
+      </w:pPr>
+      <w:rPr>
+        <w:rFonts w:ascii="Symbol" w:hAnsi="Symbol" w:hint="default"/>
+        <w:sz w:val="20"/>
+      </w:rPr>
+    </w:lvl>
+    <w:lvl w:ilvl="1" w:tentative="1">
+      <w:start w:val="1"/>
+      <w:numFmt w:val="bullet"/>
+      <w:lvlText w:val="o"/>
+      <w:lvlJc w:val="left"/>
+      <w:pPr>
+        <w:tabs>
+          <w:tab w:val="num" w:pos="1440"/>
+        </w:tabs>
+        <w:ind w:left="1440" w:hanging="360"/>
+      </w:pPr>
+      <w:rPr>
+        <w:rFonts w:ascii="Courier New" w:hAnsi="Courier New" w:hint="default"/>
+        <w:sz w:val="20"/>
+      </w:rPr>
+    </w:lvl>
+    <w:lvl w:ilvl="2" w:tentative="1">
+      <w:start w:val="1"/>
+      <w:numFmt w:val="bullet"/>
+      <w:lvlText w:val=""/>
+      <w:lvlJc w:val="left"/>
+      <w:pPr>
+        <w:tabs>
+          <w:tab w:val="num" w:pos="2160"/>
+        </w:tabs>
+        <w:ind w:left="2160" w:hanging="360"/>
+      </w:pPr>
+      <w:rPr>
+        <w:rFonts w:ascii="Wingdings" w:hAnsi="Wingdings" w:hint="default"/>
+        <w:sz w:val="20"/>
+      </w:rPr>
+    </w:lvl>
+    <w:lvl w:ilvl="3" w:tentative="1">
+      <w:start w:val="1"/>
+      <w:numFmt w:val="bullet"/>
+      <w:lvlText w:val=""/>
+      <w:lvlJc w:val="left"/>
+      <w:pPr>
+        <w:tabs>
+          <w:tab w:val="num" w:pos="2880"/>
+        </w:tabs>
+        <w:ind w:left="2880" w:hanging="360"/>
+      </w:pPr>
+      <w:rPr>
+        <w:rFonts w:ascii="Wingdings" w:hAnsi="Wingdings" w:hint="default"/>
+        <w:sz w:val="20"/>
+      </w:rPr>
+    </w:lvl>
+    <w:lvl w:ilvl="4" w:tentative="1">
+      <w:start w:val="1"/>
+      <w:numFmt w:val="bullet"/>
+      <w:lvlText w:val=""/>
+      <w:lvlJc w:val="left"/>
+      <w:pPr>
+        <w:tabs>
+          <w:tab w:val="num" w:pos="3600"/>
+        </w:tabs>
+        <w:ind w:left="3600" w:hanging="360"/>
+      </w:pPr>
+      <w:rPr>
+        <w:rFonts w:ascii="Wingdings" w:hAnsi="Wingdings" w:hint="default"/>
+        <w:sz w:val="20"/>
+      </w:rPr>
+    </w:lvl>
+    <w:lvl w:ilvl="5" w:tentative="1">
+      <w:start w:val="1"/>
+      <w:numFmt w:val="bullet"/>
+      <w:lvlText w:val=""/>
+      <w:lvlJc w:val="left"/>
+      <w:pPr>
+        <w:tabs>
+          <w:tab w:val="num" w:pos="4320"/>
+        </w:tabs>
+        <w:ind w:left="4320" w:hanging="360"/>
+      </w:pPr>
+      <w:rPr>
+        <w:rFonts w:ascii="Wingdings" w:hAnsi="Wingdings" w:hint="default"/>
+        <w:sz w:val="20"/>
+      </w:rPr>
+    </w:lvl>
+    <w:lvl w:ilvl="6" w:tentative="1">
+      <w:start w:val="1"/>
+      <w:numFmt w:val="bullet"/>
+      <w:lvlText w:val=""/>
+      <w:lvlJc w:val="left"/>
+      <w:pPr>
+        <w:tabs>
+          <w:tab w:val="num" w:pos="5040"/>
+        </w:tabs>
+        <w:ind w:left="5040" w:hanging="360"/>
+      </w:pPr>
+      <w:rPr>
+        <w:rFonts w:ascii="Wingdings" w:hAnsi="Wingdings" w:hint="default"/>
+        <w:sz w:val="20"/>
+      </w:rPr>
+    </w:lvl>
+    <w:lvl w:ilvl="7" w:tentative="1">
+      <w:start w:val="1"/>
+      <w:numFmt w:val="bullet"/>
+      <w:lvlText w:val=""/>
+      <w:lvlJc w:val="left"/>
+      <w:pPr>
+        <w:tabs>
+          <w:tab w:val="num" w:pos="5760"/>
+        </w:tabs>
+        <w:ind w:left="5760" w:hanging="360"/>
+      </w:pPr>
+      <w:rPr>
+        <w:rFonts w:ascii="Wingdings" w:hAnsi="Wingdings" w:hint="default"/>
+        <w:sz w:val="20"/>
+      </w:rPr>
+    </w:lvl>
+    <w:lvl w:ilvl="8" w:tentative="1">
+      <w:start w:val="1"/>
+      <w:numFmt w:val="bullet"/>
+      <w:lvlText w:val=""/>
+      <w:lvlJc w:val="left"/>
+      <w:pPr>
+        <w:tabs>
+          <w:tab w:val="num" w:pos="6480"/>
+        </w:tabs>
+        <w:ind w:left="6480" w:hanging="360"/>
+      </w:pPr>
+      <w:rPr>
+        <w:rFonts w:ascii="Wingdings" w:hAnsi="Wingdings" w:hint="default"/>
+        <w:sz w:val="20"/>
+      </w:rPr>
+    </w:lvl>
+  </w:abstractNum>
+  <w:abstractNum w:abstractNumId="3" w15:restartNumberingAfterBreak="0">
+    <w:nsid w:val="26234926"/>
+    <w:multiLevelType w:val="multilevel"/>
+    <w:tmpl w:val="0D864706"/>
+    <w:lvl w:ilvl="0">
+      <w:start w:val="1"/>
+      <w:numFmt w:val="decimal"/>
+      <w:lvlText w:val="%1."/>
+      <w:lvlJc w:val="left"/>
+      <w:pPr>
+        <w:tabs>
+          <w:tab w:val="num" w:pos="720"/>
+        </w:tabs>
+        <w:ind w:left="720" w:hanging="360"/>
+      </w:pPr>
+    </w:lvl>
+    <w:lvl w:ilvl="1" w:tentative="1">
+      <w:start w:val="1"/>
+      <w:numFmt w:val="decimal"/>
+      <w:lvlText w:val="%2."/>
+      <w:lvlJc w:val="left"/>
+      <w:pPr>
+        <w:tabs>
+          <w:tab w:val="num" w:pos="1440"/>
+        </w:tabs>
+        <w:ind w:left="1440" w:hanging="360"/>
+      </w:pPr>
+    </w:lvl>
+    <w:lvl w:ilvl="2" w:tentative="1">
+      <w:start w:val="1"/>
+      <w:numFmt w:val="decimal"/>
+      <w:lvlText w:val="%3."/>
+      <w:lvlJc w:val="left"/>
+      <w:pPr>
+        <w:tabs>
+          <w:tab w:val="num" w:pos="2160"/>
+        </w:tabs>
+        <w:ind w:left="2160" w:hanging="360"/>
+      </w:pPr>
+    </w:lvl>
+    <w:lvl w:ilvl="3" w:tentative="1">
+      <w:start w:val="1"/>
+      <w:numFmt w:val="decimal"/>
+      <w:lvlText w:val="%4."/>
+      <w:lvlJc w:val="left"/>
+      <w:pPr>
+        <w:tabs>
+          <w:tab w:val="num" w:pos="2880"/>
+        </w:tabs>
+        <w:ind w:left="2880" w:hanging="360"/>
+      </w:pPr>
+    </w:lvl>
+    <w:lvl w:ilvl="4" w:tentative="1">
+      <w:start w:val="1"/>
+      <w:numFmt w:val="decimal"/>
+      <w:lvlText w:val="%5."/>
+      <w:lvlJc w:val="left"/>
+      <w:pPr>
+        <w:tabs>
+          <w:tab w:val="num" w:pos="3600"/>
+        </w:tabs>
+        <w:ind w:left="3600" w:hanging="360"/>
+      </w:pPr>
+    </w:lvl>
+    <w:lvl w:ilvl="5" w:tentative="1">
+      <w:start w:val="1"/>
+      <w:numFmt w:val="decimal"/>
+      <w:lvlText w:val="%6."/>
+      <w:lvlJc w:val="left"/>
+      <w:pPr>
+        <w:tabs>
+          <w:tab w:val="num" w:pos="4320"/>
+        </w:tabs>
+        <w:ind w:left="4320" w:hanging="360"/>
+      </w:pPr>
+    </w:lvl>
+    <w:lvl w:ilvl="6" w:tentative="1">
+      <w:start w:val="1"/>
+      <w:numFmt w:val="decimal"/>
+      <w:lvlText w:val="%7."/>
+      <w:lvlJc w:val="left"/>
+      <w:pPr>
+        <w:tabs>
+          <w:tab w:val="num" w:pos="5040"/>
+        </w:tabs>
+        <w:ind w:left="5040" w:hanging="360"/>
+      </w:pPr>
+    </w:lvl>
+    <w:lvl w:ilvl="7" w:tentative="1">
+      <w:start w:val="1"/>
+      <w:numFmt w:val="decimal"/>
+      <w:lvlText w:val="%8."/>
+      <w:lvlJc w:val="left"/>
+      <w:pPr>
+        <w:tabs>
+          <w:tab w:val="num" w:pos="5760"/>
+        </w:tabs>
+        <w:ind w:left="5760" w:hanging="360"/>
+      </w:pPr>
+    </w:lvl>
+    <w:lvl w:ilvl="8" w:tentative="1">
+      <w:start w:val="1"/>
+      <w:numFmt w:val="decimal"/>
+      <w:lvlText w:val="%9."/>
+      <w:lvlJc w:val="left"/>
+      <w:pPr>
+        <w:tabs>
+          <w:tab w:val="num" w:pos="6480"/>
+        </w:tabs>
+        <w:ind w:left="6480" w:hanging="360"/>
+      </w:pPr>
+    </w:lvl>
+  </w:abstractNum>
+  <w:abstractNum w:abstractNumId="4" w15:restartNumberingAfterBreak="0">
+    <w:nsid w:val="266474EA"/>
+    <w:multiLevelType w:val="multilevel"/>
+    <w:tmpl w:val="11A8C204"/>
+    <w:lvl w:ilvl="0">
+      <w:start w:val="1"/>
+      <w:numFmt w:val="bullet"/>
+      <w:lvlText w:val=""/>
+      <w:lvlJc w:val="left"/>
+      <w:pPr>
+        <w:tabs>
+          <w:tab w:val="num" w:pos="720"/>
+        </w:tabs>
+        <w:ind w:left="720" w:hanging="360"/>
+      </w:pPr>
+      <w:rPr>
+        <w:rFonts w:ascii="Symbol" w:hAnsi="Symbol" w:hint="default"/>
+        <w:sz w:val="20"/>
+      </w:rPr>
+    </w:lvl>
+    <w:lvl w:ilvl="1" w:tentative="1">
+      <w:start w:val="1"/>
+      <w:numFmt w:val="bullet"/>
+      <w:lvlText w:val="o"/>
+      <w:lvlJc w:val="left"/>
+      <w:pPr>
+        <w:tabs>
+          <w:tab w:val="num" w:pos="1440"/>
+        </w:tabs>
+        <w:ind w:left="1440" w:hanging="360"/>
+      </w:pPr>
+      <w:rPr>
+        <w:rFonts w:ascii="Courier New" w:hAnsi="Courier New" w:hint="default"/>
+        <w:sz w:val="20"/>
+      </w:rPr>
+    </w:lvl>
+    <w:lvl w:ilvl="2" w:tentative="1">
+      <w:start w:val="1"/>
+      <w:numFmt w:val="bullet"/>
+      <w:lvlText w:val=""/>
+      <w:lvlJc w:val="left"/>
+      <w:pPr>
+        <w:tabs>
+          <w:tab w:val="num" w:pos="2160"/>
+        </w:tabs>
+        <w:ind w:left="2160" w:hanging="360"/>
+      </w:pPr>
+      <w:rPr>
+        <w:rFonts w:ascii="Wingdings" w:hAnsi="Wingdings" w:hint="default"/>
+        <w:sz w:val="20"/>
+      </w:rPr>
+    </w:lvl>
+    <w:lvl w:ilvl="3" w:tentative="1">
+      <w:start w:val="1"/>
+      <w:numFmt w:val="bullet"/>
+      <w:lvlText w:val=""/>
+      <w:lvlJc w:val="left"/>
+      <w:pPr>
+        <w:tabs>
+          <w:tab w:val="num" w:pos="2880"/>
+        </w:tabs>
+        <w:ind w:left="2880" w:hanging="360"/>
+      </w:pPr>
+      <w:rPr>
+        <w:rFonts w:ascii="Wingdings" w:hAnsi="Wingdings" w:hint="default"/>
+        <w:sz w:val="20"/>
+      </w:rPr>
+    </w:lvl>
+    <w:lvl w:ilvl="4" w:tentative="1">
+      <w:start w:val="1"/>
+      <w:numFmt w:val="bullet"/>
+      <w:lvlText w:val=""/>
+      <w:lvlJc w:val="left"/>
+      <w:pPr>
+        <w:tabs>
+          <w:tab w:val="num" w:pos="3600"/>
+        </w:tabs>
+        <w:ind w:left="3600" w:hanging="360"/>
+      </w:pPr>
+      <w:rPr>
+        <w:rFonts w:ascii="Wingdings" w:hAnsi="Wingdings" w:hint="default"/>
+        <w:sz w:val="20"/>
+      </w:rPr>
+    </w:lvl>
+    <w:lvl w:ilvl="5" w:tentative="1">
+      <w:start w:val="1"/>
+      <w:numFmt w:val="bullet"/>
+      <w:lvlText w:val=""/>
+      <w:lvlJc w:val="left"/>
+      <w:pPr>
+        <w:tabs>
+          <w:tab w:val="num" w:pos="4320"/>
+        </w:tabs>
+        <w:ind w:left="4320" w:hanging="360"/>
+      </w:pPr>
+      <w:rPr>
+        <w:rFonts w:ascii="Wingdings" w:hAnsi="Wingdings" w:hint="default"/>
+        <w:sz w:val="20"/>
+      </w:rPr>
+    </w:lvl>
+    <w:lvl w:ilvl="6" w:tentative="1">
+      <w:start w:val="1"/>
+      <w:numFmt w:val="bullet"/>
+      <w:lvlText w:val=""/>
+      <w:lvlJc w:val="left"/>
+      <w:pPr>
+        <w:tabs>
+          <w:tab w:val="num" w:pos="5040"/>
+        </w:tabs>
+        <w:ind w:left="5040" w:hanging="360"/>
+      </w:pPr>
+      <w:rPr>
+        <w:rFonts w:ascii="Wingdings" w:hAnsi="Wingdings" w:hint="default"/>
+        <w:sz w:val="20"/>
+      </w:rPr>
+    </w:lvl>
+    <w:lvl w:ilvl="7" w:tentative="1">
+      <w:start w:val="1"/>
+      <w:numFmt w:val="bullet"/>
+      <w:lvlText w:val=""/>
+      <w:lvlJc w:val="left"/>
+      <w:pPr>
+        <w:tabs>
+          <w:tab w:val="num" w:pos="5760"/>
+        </w:tabs>
+        <w:ind w:left="5760" w:hanging="360"/>
+      </w:pPr>
+      <w:rPr>
+        <w:rFonts w:ascii="Wingdings" w:hAnsi="Wingdings" w:hint="default"/>
+        <w:sz w:val="20"/>
+      </w:rPr>
+    </w:lvl>
+    <w:lvl w:ilvl="8" w:tentative="1">
+      <w:start w:val="1"/>
+      <w:numFmt w:val="bullet"/>
+      <w:lvlText w:val=""/>
+      <w:lvlJc w:val="left"/>
+      <w:pPr>
+        <w:tabs>
+          <w:tab w:val="num" w:pos="6480"/>
+        </w:tabs>
+        <w:ind w:left="6480" w:hanging="360"/>
+      </w:pPr>
+      <w:rPr>
+        <w:rFonts w:ascii="Wingdings" w:hAnsi="Wingdings" w:hint="default"/>
+        <w:sz w:val="20"/>
+      </w:rPr>
+    </w:lvl>
+  </w:abstractNum>
+  <w:abstractNum w:abstractNumId="5" w15:restartNumberingAfterBreak="0">
+    <w:nsid w:val="349A2C33"/>
+    <w:multiLevelType w:val="multilevel"/>
+    <w:tmpl w:val="A33CCABE"/>
+    <w:lvl w:ilvl="0">
+      <w:start w:val="1"/>
+      <w:numFmt w:val="bullet"/>
+      <w:lvlText w:val=""/>
+      <w:lvlJc w:val="left"/>
+      <w:pPr>
+        <w:tabs>
+          <w:tab w:val="num" w:pos="720"/>
+        </w:tabs>
+        <w:ind w:left="720" w:hanging="360"/>
+      </w:pPr>
+      <w:rPr>
+        <w:rFonts w:ascii="Symbol" w:hAnsi="Symbol" w:hint="default"/>
+        <w:sz w:val="20"/>
+      </w:rPr>
+    </w:lvl>
+    <w:lvl w:ilvl="1" w:tentative="1">
+      <w:start w:val="1"/>
+      <w:numFmt w:val="bullet"/>
+      <w:lvlText w:val="o"/>
+      <w:lvlJc w:val="left"/>
+      <w:pPr>
+        <w:tabs>
+          <w:tab w:val="num" w:pos="1440"/>
+        </w:tabs>
+        <w:ind w:left="1440" w:hanging="360"/>
+      </w:pPr>
+      <w:rPr>
+        <w:rFonts w:ascii="Courier New" w:hAnsi="Courier New" w:hint="default"/>
+        <w:sz w:val="20"/>
+      </w:rPr>
+    </w:lvl>
+    <w:lvl w:ilvl="2" w:tentative="1">
+      <w:start w:val="1"/>
+      <w:numFmt w:val="bullet"/>
+      <w:lvlText w:val=""/>
+      <w:lvlJc w:val="left"/>
+      <w:pPr>
+        <w:tabs>
+          <w:tab w:val="num" w:pos="2160"/>
+        </w:tabs>
+        <w:ind w:left="2160" w:hanging="360"/>
+      </w:pPr>
+      <w:rPr>
+        <w:rFonts w:ascii="Wingdings" w:hAnsi="Wingdings" w:hint="default"/>
+        <w:sz w:val="20"/>
+      </w:rPr>
+    </w:lvl>
+    <w:lvl w:ilvl="3" w:tentative="1">
+      <w:start w:val="1"/>
+      <w:numFmt w:val="bullet"/>
+      <w:lvlText w:val=""/>
+      <w:lvlJc w:val="left"/>
+      <w:pPr>
+        <w:tabs>
+          <w:tab w:val="num" w:pos="2880"/>
+        </w:tabs>
+        <w:ind w:left="2880" w:hanging="360"/>
+      </w:pPr>
+      <w:rPr>
+        <w:rFonts w:ascii="Wingdings" w:hAnsi="Wingdings" w:hint="default"/>
+        <w:sz w:val="20"/>
+      </w:rPr>
+    </w:lvl>
+    <w:lvl w:ilvl="4" w:tentative="1">
+      <w:start w:val="1"/>
+      <w:numFmt w:val="bullet"/>
+      <w:lvlText w:val=""/>
+      <w:lvlJc w:val="left"/>
+      <w:pPr>
+        <w:tabs>
+          <w:tab w:val="num" w:pos="3600"/>
+        </w:tabs>
+        <w:ind w:left="3600" w:hanging="360"/>
+      </w:pPr>
+      <w:rPr>
+        <w:rFonts w:ascii="Wingdings" w:hAnsi="Wingdings" w:hint="default"/>
+        <w:sz w:val="20"/>
+      </w:rPr>
+    </w:lvl>
+    <w:lvl w:ilvl="5" w:tentative="1">
+      <w:start w:val="1"/>
+      <w:numFmt w:val="bullet"/>
+      <w:lvlText w:val=""/>
+      <w:lvlJc w:val="left"/>
+      <w:pPr>
+        <w:tabs>
+          <w:tab w:val="num" w:pos="4320"/>
+        </w:tabs>
+        <w:ind w:left="4320" w:hanging="360"/>
+      </w:pPr>
+      <w:rPr>
+        <w:rFonts w:ascii="Wingdings" w:hAnsi="Wingdings" w:hint="default"/>
+        <w:sz w:val="20"/>
+      </w:rPr>
+    </w:lvl>
+    <w:lvl w:ilvl="6" w:tentative="1">
+      <w:start w:val="1"/>
+      <w:numFmt w:val="bullet"/>
+      <w:lvlText w:val=""/>
+      <w:lvlJc w:val="left"/>
+      <w:pPr>
+        <w:tabs>
+          <w:tab w:val="num" w:pos="5040"/>
+        </w:tabs>
+        <w:ind w:left="5040" w:hanging="360"/>
+      </w:pPr>
+      <w:rPr>
+        <w:rFonts w:ascii="Wingdings" w:hAnsi="Wingdings" w:hint="default"/>
+        <w:sz w:val="20"/>
+      </w:rPr>
+    </w:lvl>
+    <w:lvl w:ilvl="7" w:tentative="1">
+      <w:start w:val="1"/>
+      <w:numFmt w:val="bullet"/>
+      <w:lvlText w:val=""/>
+      <w:lvlJc w:val="left"/>
+      <w:pPr>
+        <w:tabs>
+          <w:tab w:val="num" w:pos="5760"/>
+        </w:tabs>
+        <w:ind w:left="5760" w:hanging="360"/>
+      </w:pPr>
+      <w:rPr>
+        <w:rFonts w:ascii="Wingdings" w:hAnsi="Wingdings" w:hint="default"/>
+        <w:sz w:val="20"/>
+      </w:rPr>
+    </w:lvl>
+    <w:lvl w:ilvl="8" w:tentative="1">
+      <w:start w:val="1"/>
+      <w:numFmt w:val="bullet"/>
+      <w:lvlText w:val=""/>
+      <w:lvlJc w:val="left"/>
+      <w:pPr>
+        <w:tabs>
+          <w:tab w:val="num" w:pos="6480"/>
+        </w:tabs>
+        <w:ind w:left="6480" w:hanging="360"/>
+      </w:pPr>
+      <w:rPr>
+        <w:rFonts w:ascii="Wingdings" w:hAnsi="Wingdings" w:hint="default"/>
+        <w:sz w:val="20"/>
+      </w:rPr>
+    </w:lvl>
+  </w:abstractNum>
+  <w:abstractNum w:abstractNumId="6" w15:restartNumberingAfterBreak="0">
+    <w:nsid w:val="4643317B"/>
+    <w:multiLevelType w:val="multilevel"/>
+    <w:tmpl w:val="04B637D2"/>
+    <w:lvl w:ilvl="0">
+      <w:start w:val="1"/>
+      <w:numFmt w:val="bullet"/>
+      <w:lvlText w:val=""/>
+      <w:lvlJc w:val="left"/>
+      <w:pPr>
+        <w:tabs>
+          <w:tab w:val="num" w:pos="720"/>
+        </w:tabs>
+        <w:ind w:left="720" w:hanging="360"/>
+      </w:pPr>
+      <w:rPr>
+        <w:rFonts w:ascii="Symbol" w:hAnsi="Symbol" w:hint="default"/>
+        <w:sz w:val="20"/>
+      </w:rPr>
+    </w:lvl>
+    <w:lvl w:ilvl="1" w:tentative="1">
+      <w:start w:val="1"/>
+      <w:numFmt w:val="bullet"/>
+      <w:lvlText w:val="o"/>
+      <w:lvlJc w:val="left"/>
+      <w:pPr>
+        <w:tabs>
+          <w:tab w:val="num" w:pos="1440"/>
+        </w:tabs>
+        <w:ind w:left="1440" w:hanging="360"/>
+      </w:pPr>
+      <w:rPr>
+        <w:rFonts w:ascii="Courier New" w:hAnsi="Courier New" w:hint="default"/>
+        <w:sz w:val="20"/>
+      </w:rPr>
+    </w:lvl>
+    <w:lvl w:ilvl="2" w:tentative="1">
+      <w:start w:val="1"/>
+      <w:numFmt w:val="bullet"/>
+      <w:lvlText w:val=""/>
+      <w:lvlJc w:val="left"/>
+      <w:pPr>
+        <w:tabs>
+          <w:tab w:val="num" w:pos="2160"/>
+        </w:tabs>
+        <w:ind w:left="2160" w:hanging="360"/>
+      </w:pPr>
+      <w:rPr>
+        <w:rFonts w:ascii="Wingdings" w:hAnsi="Wingdings" w:hint="default"/>
+        <w:sz w:val="20"/>
+      </w:rPr>
+    </w:lvl>
+    <w:lvl w:ilvl="3" w:tentative="1">
+      <w:start w:val="1"/>
+      <w:numFmt w:val="bullet"/>
+      <w:lvlText w:val=""/>
+      <w:lvlJc w:val="left"/>
+      <w:pPr>
+        <w:tabs>
+          <w:tab w:val="num" w:pos="2880"/>
+        </w:tabs>
+        <w:ind w:left="2880" w:hanging="360"/>
+      </w:pPr>
+      <w:rPr>
+        <w:rFonts w:ascii="Wingdings" w:hAnsi="Wingdings" w:hint="default"/>
+        <w:sz w:val="20"/>
+      </w:rPr>
+    </w:lvl>
+    <w:lvl w:ilvl="4" w:tentative="1">
+      <w:start w:val="1"/>
+      <w:numFmt w:val="bullet"/>
+      <w:lvlText w:val=""/>
+      <w:lvlJc w:val="left"/>
+      <w:pPr>
+        <w:tabs>
+          <w:tab w:val="num" w:pos="3600"/>
+        </w:tabs>
+        <w:ind w:left="3600" w:hanging="360"/>
+      </w:pPr>
+      <w:rPr>
+        <w:rFonts w:ascii="Wingdings" w:hAnsi="Wingdings" w:hint="default"/>
+        <w:sz w:val="20"/>
+      </w:rPr>
+    </w:lvl>
+    <w:lvl w:ilvl="5" w:tentative="1">
+      <w:start w:val="1"/>
+      <w:numFmt w:val="bullet"/>
+      <w:lvlText w:val=""/>
+      <w:lvlJc w:val="left"/>
+      <w:pPr>
+        <w:tabs>
+          <w:tab w:val="num" w:pos="4320"/>
+        </w:tabs>
+        <w:ind w:left="4320" w:hanging="360"/>
+      </w:pPr>
+      <w:rPr>
+        <w:rFonts w:ascii="Wingdings" w:hAnsi="Wingdings" w:hint="default"/>
+        <w:sz w:val="20"/>
+      </w:rPr>
+    </w:lvl>
+    <w:lvl w:ilvl="6" w:tentative="1">
+      <w:start w:val="1"/>
+      <w:numFmt w:val="bullet"/>
+      <w:lvlText w:val=""/>
+      <w:lvlJc w:val="left"/>
+      <w:pPr>
+        <w:tabs>
+          <w:tab w:val="num" w:pos="5040"/>
+        </w:tabs>
+        <w:ind w:left="5040" w:hanging="360"/>
+      </w:pPr>
+      <w:rPr>
+        <w:rFonts w:ascii="Wingdings" w:hAnsi="Wingdings" w:hint="default"/>
+        <w:sz w:val="20"/>
+      </w:rPr>
+    </w:lvl>
+    <w:lvl w:ilvl="7" w:tentative="1">
+      <w:start w:val="1"/>
+      <w:numFmt w:val="bullet"/>
+      <w:lvlText w:val=""/>
+      <w:lvlJc w:val="left"/>
+      <w:pPr>
+        <w:tabs>
+          <w:tab w:val="num" w:pos="5760"/>
+        </w:tabs>
+        <w:ind w:left="5760" w:hanging="360"/>
+      </w:pPr>
+      <w:rPr>
+        <w:rFonts w:ascii="Wingdings" w:hAnsi="Wingdings" w:hint="default"/>
+        <w:sz w:val="20"/>
+      </w:rPr>
+    </w:lvl>
+    <w:lvl w:ilvl="8" w:tentative="1">
+      <w:start w:val="1"/>
+      <w:numFmt w:val="bullet"/>
+      <w:lvlText w:val=""/>
+      <w:lvlJc w:val="left"/>
+      <w:pPr>
+        <w:tabs>
+          <w:tab w:val="num" w:pos="6480"/>
+        </w:tabs>
+        <w:ind w:left="6480" w:hanging="360"/>
+      </w:pPr>
+      <w:rPr>
+        <w:rFonts w:ascii="Wingdings" w:hAnsi="Wingdings" w:hint="default"/>
+        <w:sz w:val="20"/>
+      </w:rPr>
+    </w:lvl>
+  </w:abstractNum>
+  <w:abstractNum w:abstractNumId="7" w15:restartNumberingAfterBreak="0">
+    <w:nsid w:val="475A1341"/>
+    <w:multiLevelType w:val="multilevel"/>
+    <w:tmpl w:val="B2D8BE9C"/>
+    <w:lvl w:ilvl="0">
+      <w:start w:val="1"/>
+      <w:numFmt w:val="bullet"/>
+      <w:lvlText w:val=""/>
+      <w:lvlJc w:val="left"/>
+      <w:pPr>
+        <w:tabs>
+          <w:tab w:val="num" w:pos="720"/>
+        </w:tabs>
+        <w:ind w:left="720" w:hanging="360"/>
+      </w:pPr>
+      <w:rPr>
+        <w:rFonts w:ascii="Symbol" w:hAnsi="Symbol" w:hint="default"/>
+        <w:sz w:val="20"/>
+      </w:rPr>
+    </w:lvl>
+    <w:lvl w:ilvl="1" w:tentative="1">
+      <w:start w:val="1"/>
+      <w:numFmt w:val="bullet"/>
+      <w:lvlText w:val="o"/>
+      <w:lvlJc w:val="left"/>
+      <w:pPr>
+        <w:tabs>
+          <w:tab w:val="num" w:pos="1440"/>
+        </w:tabs>
+        <w:ind w:left="1440" w:hanging="360"/>
+      </w:pPr>
+      <w:rPr>
+        <w:rFonts w:ascii="Courier New" w:hAnsi="Courier New" w:hint="default"/>
+        <w:sz w:val="20"/>
+      </w:rPr>
+    </w:lvl>
+    <w:lvl w:ilvl="2" w:tentative="1">
+      <w:start w:val="1"/>
+      <w:numFmt w:val="bullet"/>
+      <w:lvlText w:val=""/>
+      <w:lvlJc w:val="left"/>
+      <w:pPr>
+        <w:tabs>
+          <w:tab w:val="num" w:pos="2160"/>
+        </w:tabs>
+        <w:ind w:left="2160" w:hanging="360"/>
+      </w:pPr>
+      <w:rPr>
+        <w:rFonts w:ascii="Wingdings" w:hAnsi="Wingdings" w:hint="default"/>
+        <w:sz w:val="20"/>
+      </w:rPr>
+    </w:lvl>
+    <w:lvl w:ilvl="3" w:tentative="1">
+      <w:start w:val="1"/>
+      <w:numFmt w:val="bullet"/>
+      <w:lvlText w:val=""/>
+      <w:lvlJc w:val="left"/>
+      <w:pPr>
+        <w:tabs>
+          <w:tab w:val="num" w:pos="2880"/>
+        </w:tabs>
+        <w:ind w:left="2880" w:hanging="360"/>
+      </w:pPr>
+      <w:rPr>
+        <w:rFonts w:ascii="Wingdings" w:hAnsi="Wingdings" w:hint="default"/>
+        <w:sz w:val="20"/>
+      </w:rPr>
+    </w:lvl>
+    <w:lvl w:ilvl="4" w:tentative="1">
+      <w:start w:val="1"/>
+      <w:numFmt w:val="bullet"/>
+      <w:lvlText w:val=""/>
+      <w:lvlJc w:val="left"/>
+      <w:pPr>
+        <w:tabs>
+          <w:tab w:val="num" w:pos="3600"/>
+        </w:tabs>
+        <w:ind w:left="3600" w:hanging="360"/>
+      </w:pPr>
+      <w:rPr>
+        <w:rFonts w:ascii="Wingdings" w:hAnsi="Wingdings" w:hint="default"/>
+        <w:sz w:val="20"/>
+      </w:rPr>
+    </w:lvl>
+    <w:lvl w:ilvl="5" w:tentative="1">
+      <w:start w:val="1"/>
+      <w:numFmt w:val="bullet"/>
+      <w:lvlText w:val=""/>
+      <w:lvlJc w:val="left"/>
+      <w:pPr>
+        <w:tabs>
+          <w:tab w:val="num" w:pos="4320"/>
+        </w:tabs>
+        <w:ind w:left="4320" w:hanging="360"/>
+      </w:pPr>
+      <w:rPr>
+        <w:rFonts w:ascii="Wingdings" w:hAnsi="Wingdings" w:hint="default"/>
+        <w:sz w:val="20"/>
+      </w:rPr>
+    </w:lvl>
+    <w:lvl w:ilvl="6" w:tentative="1">
+      <w:start w:val="1"/>
+      <w:numFmt w:val="bullet"/>
+      <w:lvlText w:val=""/>
+      <w:lvlJc w:val="left"/>
+      <w:pPr>
+        <w:tabs>
+          <w:tab w:val="num" w:pos="5040"/>
+        </w:tabs>
+        <w:ind w:left="5040" w:hanging="360"/>
+      </w:pPr>
+      <w:rPr>
+        <w:rFonts w:ascii="Wingdings" w:hAnsi="Wingdings" w:hint="default"/>
+        <w:sz w:val="20"/>
+      </w:rPr>
+    </w:lvl>
+    <w:lvl w:ilvl="7" w:tentative="1">
+      <w:start w:val="1"/>
+      <w:numFmt w:val="bullet"/>
+      <w:lvlText w:val=""/>
+      <w:lvlJc w:val="left"/>
+      <w:pPr>
+        <w:tabs>
+          <w:tab w:val="num" w:pos="5760"/>
+        </w:tabs>
+        <w:ind w:left="5760" w:hanging="360"/>
+      </w:pPr>
+      <w:rPr>
+        <w:rFonts w:ascii="Wingdings" w:hAnsi="Wingdings" w:hint="default"/>
+        <w:sz w:val="20"/>
+      </w:rPr>
+    </w:lvl>
+    <w:lvl w:ilvl="8" w:tentative="1">
+      <w:start w:val="1"/>
+      <w:numFmt w:val="bullet"/>
+      <w:lvlText w:val=""/>
+      <w:lvlJc w:val="left"/>
+      <w:pPr>
+        <w:tabs>
+          <w:tab w:val="num" w:pos="6480"/>
+        </w:tabs>
+        <w:ind w:left="6480" w:hanging="360"/>
+      </w:pPr>
+      <w:rPr>
+        <w:rFonts w:ascii="Wingdings" w:hAnsi="Wingdings" w:hint="default"/>
+        <w:sz w:val="20"/>
+      </w:rPr>
+    </w:lvl>
+  </w:abstractNum>
+  <w:abstractNum w:abstractNumId="8" w15:restartNumberingAfterBreak="0">
+    <w:nsid w:val="5F545D9F"/>
+    <w:multiLevelType w:val="multilevel"/>
+    <w:tmpl w:val="C32E4040"/>
+    <w:lvl w:ilvl="0">
+      <w:start w:val="1"/>
+      <w:numFmt w:val="bullet"/>
+      <w:lvlText w:val=""/>
+      <w:lvlJc w:val="left"/>
+      <w:pPr>
+        <w:tabs>
+          <w:tab w:val="num" w:pos="720"/>
+        </w:tabs>
+        <w:ind w:left="720" w:hanging="360"/>
+      </w:pPr>
+      <w:rPr>
+        <w:rFonts w:ascii="Symbol" w:hAnsi="Symbol" w:hint="default"/>
+        <w:sz w:val="20"/>
+      </w:rPr>
+    </w:lvl>
+    <w:lvl w:ilvl="1" w:tentative="1">
+      <w:start w:val="1"/>
+      <w:numFmt w:val="bullet"/>
+      <w:lvlText w:val="o"/>
+      <w:lvlJc w:val="left"/>
+      <w:pPr>
+        <w:tabs>
+          <w:tab w:val="num" w:pos="1440"/>
+        </w:tabs>
+        <w:ind w:left="1440" w:hanging="360"/>
+      </w:pPr>
+      <w:rPr>
+        <w:rFonts w:ascii="Courier New" w:hAnsi="Courier New" w:hint="default"/>
+        <w:sz w:val="20"/>
+      </w:rPr>
+    </w:lvl>
+    <w:lvl w:ilvl="2" w:tentative="1">
+      <w:start w:val="1"/>
+      <w:numFmt w:val="bullet"/>
+      <w:lvlText w:val=""/>
+      <w:lvlJc w:val="left"/>
+      <w:pPr>
+        <w:tabs>
+          <w:tab w:val="num" w:pos="2160"/>
+        </w:tabs>
+        <w:ind w:left="2160" w:hanging="360"/>
+      </w:pPr>
+      <w:rPr>
+        <w:rFonts w:ascii="Wingdings" w:hAnsi="Wingdings" w:hint="default"/>
+        <w:sz w:val="20"/>
+      </w:rPr>
+    </w:lvl>
+    <w:lvl w:ilvl="3" w:tentative="1">
+      <w:start w:val="1"/>
+      <w:numFmt w:val="bullet"/>
+      <w:lvlText w:val=""/>
+      <w:lvlJc w:val="left"/>
+      <w:pPr>
+        <w:tabs>
+          <w:tab w:val="num" w:pos="2880"/>
+        </w:tabs>
+        <w:ind w:left="2880" w:hanging="360"/>
+      </w:pPr>
+      <w:rPr>
+        <w:rFonts w:ascii="Wingdings" w:hAnsi="Wingdings" w:hint="default"/>
+        <w:sz w:val="20"/>
+      </w:rPr>
+    </w:lvl>
+    <w:lvl w:ilvl="4" w:tentative="1">
+      <w:start w:val="1"/>
+      <w:numFmt w:val="bullet"/>
+      <w:lvlText w:val=""/>
+      <w:lvlJc w:val="left"/>
+      <w:pPr>
+        <w:tabs>
+          <w:tab w:val="num" w:pos="3600"/>
+        </w:tabs>
+        <w:ind w:left="3600" w:hanging="360"/>
+      </w:pPr>
+      <w:rPr>
+        <w:rFonts w:ascii="Wingdings" w:hAnsi="Wingdings" w:hint="default"/>
+        <w:sz w:val="20"/>
+      </w:rPr>
+    </w:lvl>
+    <w:lvl w:ilvl="5" w:tentative="1">
+      <w:start w:val="1"/>
+      <w:numFmt w:val="bullet"/>
+      <w:lvlText w:val=""/>
+      <w:lvlJc w:val="left"/>
+      <w:pPr>
+        <w:tabs>
+          <w:tab w:val="num" w:pos="4320"/>
+        </w:tabs>
+        <w:ind w:left="4320" w:hanging="360"/>
+      </w:pPr>
+      <w:rPr>
+        <w:rFonts w:ascii="Wingdings" w:hAnsi="Wingdings" w:hint="default"/>
+        <w:sz w:val="20"/>
+      </w:rPr>
+    </w:lvl>
+    <w:lvl w:ilvl="6" w:tentative="1">
+      <w:start w:val="1"/>
+      <w:numFmt w:val="bullet"/>
+      <w:lvlText w:val=""/>
+      <w:lvlJc w:val="left"/>
+      <w:pPr>
+        <w:tabs>
+          <w:tab w:val="num" w:pos="5040"/>
+        </w:tabs>
+        <w:ind w:left="5040" w:hanging="360"/>
+      </w:pPr>
+      <w:rPr>
+        <w:rFonts w:ascii="Wingdings" w:hAnsi="Wingdings" w:hint="default"/>
+        <w:sz w:val="20"/>
+      </w:rPr>
+    </w:lvl>
+    <w:lvl w:ilvl="7" w:tentative="1">
+      <w:start w:val="1"/>
+      <w:numFmt w:val="bullet"/>
+      <w:lvlText w:val=""/>
+      <w:lvlJc w:val="left"/>
+      <w:pPr>
+        <w:tabs>
+          <w:tab w:val="num" w:pos="5760"/>
+        </w:tabs>
+        <w:ind w:left="5760" w:hanging="360"/>
+      </w:pPr>
+      <w:rPr>
+        <w:rFonts w:ascii="Wingdings" w:hAnsi="Wingdings" w:hint="default"/>
+        <w:sz w:val="20"/>
+      </w:rPr>
+    </w:lvl>
+    <w:lvl w:ilvl="8" w:tentative="1">
+      <w:start w:val="1"/>
+      <w:numFmt w:val="bullet"/>
+      <w:lvlText w:val=""/>
+      <w:lvlJc w:val="left"/>
+      <w:pPr>
+        <w:tabs>
+          <w:tab w:val="num" w:pos="6480"/>
+        </w:tabs>
+        <w:ind w:left="6480" w:hanging="360"/>
+      </w:pPr>
+      <w:rPr>
+        <w:rFonts w:ascii="Wingdings" w:hAnsi="Wingdings" w:hint="default"/>
+        <w:sz w:val="20"/>
+      </w:rPr>
+    </w:lvl>
+  </w:abstractNum>
+  <w:abstractNum w:abstractNumId="9" w15:restartNumberingAfterBreak="0">
+    <w:nsid w:val="61943C36"/>
+    <w:multiLevelType w:val="multilevel"/>
+    <w:tmpl w:val="322A06A0"/>
+    <w:lvl w:ilvl="0">
+      <w:start w:val="1"/>
+      <w:numFmt w:val="bullet"/>
+      <w:lvlText w:val=""/>
+      <w:lvlJc w:val="left"/>
+      <w:pPr>
+        <w:tabs>
+          <w:tab w:val="num" w:pos="720"/>
+        </w:tabs>
+        <w:ind w:left="720" w:hanging="360"/>
+      </w:pPr>
+      <w:rPr>
+        <w:rFonts w:ascii="Symbol" w:hAnsi="Symbol" w:hint="default"/>
+        <w:sz w:val="20"/>
+      </w:rPr>
+    </w:lvl>
+    <w:lvl w:ilvl="1" w:tentative="1">
+      <w:start w:val="1"/>
+      <w:numFmt w:val="bullet"/>
+      <w:lvlText w:val="o"/>
+      <w:lvlJc w:val="left"/>
+      <w:pPr>
+        <w:tabs>
+          <w:tab w:val="num" w:pos="1440"/>
+        </w:tabs>
+        <w:ind w:left="1440" w:hanging="360"/>
+      </w:pPr>
+      <w:rPr>
+        <w:rFonts w:ascii="Courier New" w:hAnsi="Courier New" w:hint="default"/>
+        <w:sz w:val="20"/>
+      </w:rPr>
+    </w:lvl>
+    <w:lvl w:ilvl="2" w:tentative="1">
+      <w:start w:val="1"/>
+      <w:numFmt w:val="bullet"/>
+      <w:lvlText w:val=""/>
+      <w:lvlJc w:val="left"/>
+      <w:pPr>
+        <w:tabs>
+          <w:tab w:val="num" w:pos="2160"/>
+        </w:tabs>
+        <w:ind w:left="2160" w:hanging="360"/>
+      </w:pPr>
+      <w:rPr>
+        <w:rFonts w:ascii="Wingdings" w:hAnsi="Wingdings" w:hint="default"/>
+        <w:sz w:val="20"/>
+      </w:rPr>
+    </w:lvl>
+    <w:lvl w:ilvl="3" w:tentative="1">
+      <w:start w:val="1"/>
+      <w:numFmt w:val="bullet"/>
+      <w:lvlText w:val=""/>
+      <w:lvlJc w:val="left"/>
+      <w:pPr>
+        <w:tabs>
+          <w:tab w:val="num" w:pos="2880"/>
+        </w:tabs>
+        <w:ind w:left="2880" w:hanging="360"/>
+      </w:pPr>
+      <w:rPr>
+        <w:rFonts w:ascii="Wingdings" w:hAnsi="Wingdings" w:hint="default"/>
+        <w:sz w:val="20"/>
+      </w:rPr>
+    </w:lvl>
+    <w:lvl w:ilvl="4" w:tentative="1">
+      <w:start w:val="1"/>
+      <w:numFmt w:val="bullet"/>
+      <w:lvlText w:val=""/>
+      <w:lvlJc w:val="left"/>
+      <w:pPr>
+        <w:tabs>
+          <w:tab w:val="num" w:pos="3600"/>
+        </w:tabs>
+        <w:ind w:left="3600" w:hanging="360"/>
+      </w:pPr>
+      <w:rPr>
+        <w:rFonts w:ascii="Wingdings" w:hAnsi="Wingdings" w:hint="default"/>
+        <w:sz w:val="20"/>
+      </w:rPr>
+    </w:lvl>
+    <w:lvl w:ilvl="5" w:tentative="1">
+      <w:start w:val="1"/>
+      <w:numFmt w:val="bullet"/>
+      <w:lvlText w:val=""/>
+      <w:lvlJc w:val="left"/>
+      <w:pPr>
+        <w:tabs>
+          <w:tab w:val="num" w:pos="4320"/>
+        </w:tabs>
+        <w:ind w:left="4320" w:hanging="360"/>
+      </w:pPr>
+      <w:rPr>
+        <w:rFonts w:ascii="Wingdings" w:hAnsi="Wingdings" w:hint="default"/>
+        <w:sz w:val="20"/>
+      </w:rPr>
+    </w:lvl>
+    <w:lvl w:ilvl="6" w:tentative="1">
+      <w:start w:val="1"/>
+      <w:numFmt w:val="bullet"/>
+      <w:lvlText w:val=""/>
+      <w:lvlJc w:val="left"/>
+      <w:pPr>
+        <w:tabs>
+          <w:tab w:val="num" w:pos="5040"/>
+        </w:tabs>
+        <w:ind w:left="5040" w:hanging="360"/>
+      </w:pPr>
+      <w:rPr>
+        <w:rFonts w:ascii="Wingdings" w:hAnsi="Wingdings" w:hint="default"/>
+        <w:sz w:val="20"/>
+      </w:rPr>
+    </w:lvl>
+    <w:lvl w:ilvl="7" w:tentative="1">
+      <w:start w:val="1"/>
+      <w:numFmt w:val="bullet"/>
+      <w:lvlText w:val=""/>
+      <w:lvlJc w:val="left"/>
+      <w:pPr>
+        <w:tabs>
+          <w:tab w:val="num" w:pos="5760"/>
+        </w:tabs>
+        <w:ind w:left="5760" w:hanging="360"/>
+      </w:pPr>
+      <w:rPr>
+        <w:rFonts w:ascii="Wingdings" w:hAnsi="Wingdings" w:hint="default"/>
+        <w:sz w:val="20"/>
+      </w:rPr>
+    </w:lvl>
+    <w:lvl w:ilvl="8" w:tentative="1">
+      <w:start w:val="1"/>
+      <w:numFmt w:val="bullet"/>
+      <w:lvlText w:val=""/>
+      <w:lvlJc w:val="left"/>
+      <w:pPr>
+        <w:tabs>
+          <w:tab w:val="num" w:pos="6480"/>
+        </w:tabs>
+        <w:ind w:left="6480" w:hanging="360"/>
+      </w:pPr>
+      <w:rPr>
+        <w:rFonts w:ascii="Wingdings" w:hAnsi="Wingdings" w:hint="default"/>
+        <w:sz w:val="20"/>
+      </w:rPr>
+    </w:lvl>
+  </w:abstractNum>
+  <w:abstractNum w:abstractNumId="10" w15:restartNumberingAfterBreak="0">
+    <w:nsid w:val="65884CA4"/>
+    <w:multiLevelType w:val="multilevel"/>
+    <w:tmpl w:val="EC12F45E"/>
+    <w:lvl w:ilvl="0">
+      <w:start w:val="1"/>
+      <w:numFmt w:val="bullet"/>
+      <w:lvlText w:val=""/>
+      <w:lvlJc w:val="left"/>
+      <w:pPr>
+        <w:tabs>
+          <w:tab w:val="num" w:pos="720"/>
+        </w:tabs>
+        <w:ind w:left="720" w:hanging="360"/>
+      </w:pPr>
+      <w:rPr>
+        <w:rFonts w:ascii="Symbol" w:hAnsi="Symbol" w:hint="default"/>
+        <w:sz w:val="20"/>
+      </w:rPr>
+    </w:lvl>
+    <w:lvl w:ilvl="1" w:tentative="1">
+      <w:start w:val="1"/>
+      <w:numFmt w:val="bullet"/>
+      <w:lvlText w:val="o"/>
+      <w:lvlJc w:val="left"/>
+      <w:pPr>
+        <w:tabs>
+          <w:tab w:val="num" w:pos="1440"/>
+        </w:tabs>
+        <w:ind w:left="1440" w:hanging="360"/>
+      </w:pPr>
+      <w:rPr>
+        <w:rFonts w:ascii="Courier New" w:hAnsi="Courier New" w:hint="default"/>
+        <w:sz w:val="20"/>
+      </w:rPr>
+    </w:lvl>
+    <w:lvl w:ilvl="2" w:tentative="1">
+      <w:start w:val="1"/>
+      <w:numFmt w:val="bullet"/>
+      <w:lvlText w:val=""/>
+      <w:lvlJc w:val="left"/>
+      <w:pPr>
+        <w:tabs>
+          <w:tab w:val="num" w:pos="2160"/>
+        </w:tabs>
+        <w:ind w:left="2160" w:hanging="360"/>
+      </w:pPr>
+      <w:rPr>
+        <w:rFonts w:ascii="Wingdings" w:hAnsi="Wingdings" w:hint="default"/>
+        <w:sz w:val="20"/>
+      </w:rPr>
+    </w:lvl>
+    <w:lvl w:ilvl="3" w:tentative="1">
+      <w:start w:val="1"/>
+      <w:numFmt w:val="bullet"/>
+      <w:lvlText w:val=""/>
+      <w:lvlJc w:val="left"/>
+      <w:pPr>
+        <w:tabs>
+          <w:tab w:val="num" w:pos="2880"/>
+        </w:tabs>
+        <w:ind w:left="2880" w:hanging="360"/>
+      </w:pPr>
+      <w:rPr>
+        <w:rFonts w:ascii="Wingdings" w:hAnsi="Wingdings" w:hint="default"/>
+        <w:sz w:val="20"/>
+      </w:rPr>
+    </w:lvl>
+    <w:lvl w:ilvl="4" w:tentative="1">
+      <w:start w:val="1"/>
+      <w:numFmt w:val="bullet"/>
+      <w:lvlText w:val=""/>
+      <w:lvlJc w:val="left"/>
+      <w:pPr>
+        <w:tabs>
+          <w:tab w:val="num" w:pos="3600"/>
+        </w:tabs>
+        <w:ind w:left="3600" w:hanging="360"/>
+      </w:pPr>
+      <w:rPr>
+        <w:rFonts w:ascii="Wingdings" w:hAnsi="Wingdings" w:hint="default"/>
+        <w:sz w:val="20"/>
+      </w:rPr>
+    </w:lvl>
+    <w:lvl w:ilvl="5" w:tentative="1">
+      <w:start w:val="1"/>
+      <w:numFmt w:val="bullet"/>
+      <w:lvlText w:val=""/>
+      <w:lvlJc w:val="left"/>
+      <w:pPr>
+        <w:tabs>
+          <w:tab w:val="num" w:pos="4320"/>
+        </w:tabs>
+        <w:ind w:left="4320" w:hanging="360"/>
+      </w:pPr>
+      <w:rPr>
+        <w:rFonts w:ascii="Wingdings" w:hAnsi="Wingdings" w:hint="default"/>
+        <w:sz w:val="20"/>
+      </w:rPr>
+    </w:lvl>
+    <w:lvl w:ilvl="6" w:tentative="1">
+      <w:start w:val="1"/>
+      <w:numFmt w:val="bullet"/>
+      <w:lvlText w:val=""/>
+      <w:lvlJc w:val="left"/>
+      <w:pPr>
+        <w:tabs>
+          <w:tab w:val="num" w:pos="5040"/>
+        </w:tabs>
+        <w:ind w:left="5040" w:hanging="360"/>
+      </w:pPr>
+      <w:rPr>
+        <w:rFonts w:ascii="Wingdings" w:hAnsi="Wingdings" w:hint="default"/>
+        <w:sz w:val="20"/>
+      </w:rPr>
+    </w:lvl>
+    <w:lvl w:ilvl="7" w:tentative="1">
+      <w:start w:val="1"/>
+      <w:numFmt w:val="bullet"/>
+      <w:lvlText w:val=""/>
+      <w:lvlJc w:val="left"/>
+      <w:pPr>
+        <w:tabs>
+          <w:tab w:val="num" w:pos="5760"/>
+        </w:tabs>
+        <w:ind w:left="5760" w:hanging="360"/>
+      </w:pPr>
+      <w:rPr>
+        <w:rFonts w:ascii="Wingdings" w:hAnsi="Wingdings" w:hint="default"/>
+        <w:sz w:val="20"/>
+      </w:rPr>
+    </w:lvl>
+    <w:lvl w:ilvl="8" w:tentative="1">
+      <w:start w:val="1"/>
+      <w:numFmt w:val="bullet"/>
+      <w:lvlText w:val=""/>
+      <w:lvlJc w:val="left"/>
+      <w:pPr>
+        <w:tabs>
+          <w:tab w:val="num" w:pos="6480"/>
+        </w:tabs>
+        <w:ind w:left="6480" w:hanging="360"/>
+      </w:pPr>
+      <w:rPr>
+        <w:rFonts w:ascii="Wingdings" w:hAnsi="Wingdings" w:hint="default"/>
+        <w:sz w:val="20"/>
+      </w:rPr>
+    </w:lvl>
+  </w:abstractNum>
+  <w:abstractNum w:abstractNumId="11" w15:restartNumberingAfterBreak="0">
+    <w:nsid w:val="6BD3499B"/>
+    <w:multiLevelType w:val="multilevel"/>
+    <w:tmpl w:val="0C462ED8"/>
+    <w:lvl w:ilvl="0">
+      <w:start w:val="1"/>
+      <w:numFmt w:val="bullet"/>
+      <w:lvlText w:val=""/>
+      <w:lvlJc w:val="left"/>
+      <w:pPr>
+        <w:tabs>
+          <w:tab w:val="num" w:pos="720"/>
+        </w:tabs>
+        <w:ind w:left="720" w:hanging="360"/>
+      </w:pPr>
+      <w:rPr>
+        <w:rFonts w:ascii="Symbol" w:hAnsi="Symbol" w:hint="default"/>
+        <w:sz w:val="20"/>
+      </w:rPr>
+    </w:lvl>
+    <w:lvl w:ilvl="1" w:tentative="1">
+      <w:start w:val="1"/>
+      <w:numFmt w:val="bullet"/>
+      <w:lvlText w:val="o"/>
+      <w:lvlJc w:val="left"/>
+      <w:pPr>
+        <w:tabs>
+          <w:tab w:val="num" w:pos="1440"/>
+        </w:tabs>
+        <w:ind w:left="1440" w:hanging="360"/>
+      </w:pPr>
+      <w:rPr>
+        <w:rFonts w:ascii="Courier New" w:hAnsi="Courier New" w:hint="default"/>
+        <w:sz w:val="20"/>
+      </w:rPr>
+    </w:lvl>
+    <w:lvl w:ilvl="2" w:tentative="1">
+      <w:start w:val="1"/>
+      <w:numFmt w:val="bullet"/>
+      <w:lvlText w:val=""/>
+      <w:lvlJc w:val="left"/>
+      <w:pPr>
+        <w:tabs>
+          <w:tab w:val="num" w:pos="2160"/>
+        </w:tabs>
+        <w:ind w:left="2160" w:hanging="360"/>
+      </w:pPr>
+      <w:rPr>
+        <w:rFonts w:ascii="Wingdings" w:hAnsi="Wingdings" w:hint="default"/>
+        <w:sz w:val="20"/>
+      </w:rPr>
+    </w:lvl>
+    <w:lvl w:ilvl="3" w:tentative="1">
+      <w:start w:val="1"/>
+      <w:numFmt w:val="bullet"/>
+      <w:lvlText w:val=""/>
+      <w:lvlJc w:val="left"/>
+      <w:pPr>
+        <w:tabs>
+          <w:tab w:val="num" w:pos="2880"/>
+        </w:tabs>
+        <w:ind w:left="2880" w:hanging="360"/>
+      </w:pPr>
+      <w:rPr>
+        <w:rFonts w:ascii="Wingdings" w:hAnsi="Wingdings" w:hint="default"/>
+        <w:sz w:val="20"/>
+      </w:rPr>
+    </w:lvl>
+    <w:lvl w:ilvl="4" w:tentative="1">
+      <w:start w:val="1"/>
+      <w:numFmt w:val="bullet"/>
+      <w:lvlText w:val=""/>
+      <w:lvlJc w:val="left"/>
+      <w:pPr>
+        <w:tabs>
+          <w:tab w:val="num" w:pos="3600"/>
+        </w:tabs>
+        <w:ind w:left="3600" w:hanging="360"/>
+      </w:pPr>
+      <w:rPr>
+        <w:rFonts w:ascii="Wingdings" w:hAnsi="Wingdings" w:hint="default"/>
+        <w:sz w:val="20"/>
+      </w:rPr>
+    </w:lvl>
+    <w:lvl w:ilvl="5" w:tentative="1">
+      <w:start w:val="1"/>
+      <w:numFmt w:val="bullet"/>
+      <w:lvlText w:val=""/>
+      <w:lvlJc w:val="left"/>
+      <w:pPr>
+        <w:tabs>
+          <w:tab w:val="num" w:pos="4320"/>
+        </w:tabs>
+        <w:ind w:left="4320" w:hanging="360"/>
+      </w:pPr>
+      <w:rPr>
+        <w:rFonts w:ascii="Wingdings" w:hAnsi="Wingdings" w:hint="default"/>
+        <w:sz w:val="20"/>
+      </w:rPr>
+    </w:lvl>
+    <w:lvl w:ilvl="6" w:tentative="1">
+      <w:start w:val="1"/>
+      <w:numFmt w:val="bullet"/>
+      <w:lvlText w:val=""/>
+      <w:lvlJc w:val="left"/>
+      <w:pPr>
+        <w:tabs>
+          <w:tab w:val="num" w:pos="5040"/>
+        </w:tabs>
+        <w:ind w:left="5040" w:hanging="360"/>
+      </w:pPr>
+      <w:rPr>
+        <w:rFonts w:ascii="Wingdings" w:hAnsi="Wingdings" w:hint="default"/>
+        <w:sz w:val="20"/>
+      </w:rPr>
+    </w:lvl>
+    <w:lvl w:ilvl="7" w:tentative="1">
+      <w:start w:val="1"/>
+      <w:numFmt w:val="bullet"/>
+      <w:lvlText w:val=""/>
+      <w:lvlJc w:val="left"/>
+      <w:pPr>
+        <w:tabs>
+          <w:tab w:val="num" w:pos="5760"/>
+        </w:tabs>
+        <w:ind w:left="5760" w:hanging="360"/>
+      </w:pPr>
+      <w:rPr>
+        <w:rFonts w:ascii="Wingdings" w:hAnsi="Wingdings" w:hint="default"/>
+        <w:sz w:val="20"/>
+      </w:rPr>
+    </w:lvl>
+    <w:lvl w:ilvl="8" w:tentative="1">
+      <w:start w:val="1"/>
+      <w:numFmt w:val="bullet"/>
+      <w:lvlText w:val=""/>
+      <w:lvlJc w:val="left"/>
+      <w:pPr>
+        <w:tabs>
+          <w:tab w:val="num" w:pos="6480"/>
+        </w:tabs>
+        <w:ind w:left="6480" w:hanging="360"/>
+      </w:pPr>
+      <w:rPr>
+        <w:rFonts w:ascii="Wingdings" w:hAnsi="Wingdings" w:hint="default"/>
+        <w:sz w:val="20"/>
+      </w:rPr>
+    </w:lvl>
+  </w:abstractNum>
+  <w:abstractNum w:abstractNumId="12" w15:restartNumberingAfterBreak="0">
+    <w:nsid w:val="6FEF7CA1"/>
+    <w:multiLevelType w:val="multilevel"/>
+    <w:tmpl w:val="F948F8BE"/>
+    <w:lvl w:ilvl="0">
+      <w:start w:val="1"/>
+      <w:numFmt w:val="bullet"/>
+      <w:lvlText w:val=""/>
+      <w:lvlJc w:val="left"/>
+      <w:pPr>
+        <w:tabs>
+          <w:tab w:val="num" w:pos="720"/>
+        </w:tabs>
+        <w:ind w:left="720" w:hanging="360"/>
+      </w:pPr>
+      <w:rPr>
+        <w:rFonts w:ascii="Symbol" w:hAnsi="Symbol" w:hint="default"/>
+        <w:sz w:val="20"/>
+      </w:rPr>
+    </w:lvl>
+    <w:lvl w:ilvl="1" w:tentative="1">
+      <w:start w:val="1"/>
+      <w:numFmt w:val="bullet"/>
+      <w:lvlText w:val="o"/>
+      <w:lvlJc w:val="left"/>
+      <w:pPr>
+        <w:tabs>
+          <w:tab w:val="num" w:pos="1440"/>
+        </w:tabs>
+        <w:ind w:left="1440" w:hanging="360"/>
+      </w:pPr>
+      <w:rPr>
+        <w:rFonts w:ascii="Courier New" w:hAnsi="Courier New" w:hint="default"/>
+        <w:sz w:val="20"/>
+      </w:rPr>
+    </w:lvl>
+    <w:lvl w:ilvl="2" w:tentative="1">
+      <w:start w:val="1"/>
+      <w:numFmt w:val="bullet"/>
+      <w:lvlText w:val=""/>
+      <w:lvlJc w:val="left"/>
+      <w:pPr>
+        <w:tabs>
+          <w:tab w:val="num" w:pos="2160"/>
+        </w:tabs>
+        <w:ind w:left="2160" w:hanging="360"/>
+      </w:pPr>
+      <w:rPr>
+        <w:rFonts w:ascii="Wingdings" w:hAnsi="Wingdings" w:hint="default"/>
+        <w:sz w:val="20"/>
+      </w:rPr>
+    </w:lvl>
+    <w:lvl w:ilvl="3" w:tentative="1">
+      <w:start w:val="1"/>
+      <w:numFmt w:val="bullet"/>
+      <w:lvlText w:val=""/>
+      <w:lvlJc w:val="left"/>
+      <w:pPr>
+        <w:tabs>
+          <w:tab w:val="num" w:pos="2880"/>
+        </w:tabs>
+        <w:ind w:left="2880" w:hanging="360"/>
+      </w:pPr>
+      <w:rPr>
+        <w:rFonts w:ascii="Wingdings" w:hAnsi="Wingdings" w:hint="default"/>
+        <w:sz w:val="20"/>
+      </w:rPr>
+    </w:lvl>
+    <w:lvl w:ilvl="4" w:tentative="1">
+      <w:start w:val="1"/>
+      <w:numFmt w:val="bullet"/>
+      <w:lvlText w:val=""/>
+      <w:lvlJc w:val="left"/>
+      <w:pPr>
+        <w:tabs>
+          <w:tab w:val="num" w:pos="3600"/>
+        </w:tabs>
+        <w:ind w:left="3600" w:hanging="360"/>
+      </w:pPr>
+      <w:rPr>
+        <w:rFonts w:ascii="Wingdings" w:hAnsi="Wingdings" w:hint="default"/>
+        <w:sz w:val="20"/>
+      </w:rPr>
+    </w:lvl>
+    <w:lvl w:ilvl="5" w:tentative="1">
+      <w:start w:val="1"/>
+      <w:numFmt w:val="bullet"/>
+      <w:lvlText w:val=""/>
+      <w:lvlJc w:val="left"/>
+      <w:pPr>
+        <w:tabs>
+          <w:tab w:val="num" w:pos="4320"/>
+        </w:tabs>
+        <w:ind w:left="4320" w:hanging="360"/>
+      </w:pPr>
+      <w:rPr>
+        <w:rFonts w:ascii="Wingdings" w:hAnsi="Wingdings" w:hint="default"/>
+        <w:sz w:val="20"/>
+      </w:rPr>
+    </w:lvl>
+    <w:lvl w:ilvl="6" w:tentative="1">
+      <w:start w:val="1"/>
+      <w:numFmt w:val="bullet"/>
+      <w:lvlText w:val=""/>
+      <w:lvlJc w:val="left"/>
+      <w:pPr>
+        <w:tabs>
+          <w:tab w:val="num" w:pos="5040"/>
+        </w:tabs>
+        <w:ind w:left="5040" w:hanging="360"/>
+      </w:pPr>
+      <w:rPr>
+        <w:rFonts w:ascii="Wingdings" w:hAnsi="Wingdings" w:hint="default"/>
+        <w:sz w:val="20"/>
+      </w:rPr>
+    </w:lvl>
+    <w:lvl w:ilvl="7" w:tentative="1">
+      <w:start w:val="1"/>
+      <w:numFmt w:val="bullet"/>
+      <w:lvlText w:val=""/>
+      <w:lvlJc w:val="left"/>
+      <w:pPr>
+        <w:tabs>
+          <w:tab w:val="num" w:pos="5760"/>
+        </w:tabs>
+        <w:ind w:left="5760" w:hanging="360"/>
+      </w:pPr>
+      <w:rPr>
+        <w:rFonts w:ascii="Wingdings" w:hAnsi="Wingdings" w:hint="default"/>
+        <w:sz w:val="20"/>
+      </w:rPr>
+    </w:lvl>
+    <w:lvl w:ilvl="8" w:tentative="1">
+      <w:start w:val="1"/>
+      <w:numFmt w:val="bullet"/>
+      <w:lvlText w:val=""/>
+      <w:lvlJc w:val="left"/>
+      <w:pPr>
+        <w:tabs>
+          <w:tab w:val="num" w:pos="6480"/>
+        </w:tabs>
+        <w:ind w:left="6480" w:hanging="360"/>
+      </w:pPr>
+      <w:rPr>
+        <w:rFonts w:ascii="Wingdings" w:hAnsi="Wingdings" w:hint="default"/>
+        <w:sz w:val="20"/>
+      </w:rPr>
+    </w:lvl>
+  </w:abstractNum>
+  <w:abstractNum w:abstractNumId="13" w15:restartNumberingAfterBreak="0">
+    <w:nsid w:val="78470265"/>
+    <w:multiLevelType w:val="multilevel"/>
+    <w:tmpl w:val="16806B52"/>
+    <w:lvl w:ilvl="0">
+      <w:start w:val="1"/>
+      <w:numFmt w:val="decimal"/>
+      <w:lvlText w:val="%1."/>
+      <w:lvlJc w:val="left"/>
+      <w:pPr>
+        <w:tabs>
+          <w:tab w:val="num" w:pos="720"/>
+        </w:tabs>
+        <w:ind w:left="720" w:hanging="360"/>
+      </w:pPr>
+    </w:lvl>
+    <w:lvl w:ilvl="1" w:tentative="1">
+      <w:start w:val="1"/>
+      <w:numFmt w:val="decimal"/>
+      <w:lvlText w:val="%2."/>
+      <w:lvlJc w:val="left"/>
+      <w:pPr>
+        <w:tabs>
+          <w:tab w:val="num" w:pos="1440"/>
+        </w:tabs>
+        <w:ind w:left="1440" w:hanging="360"/>
+      </w:pPr>
+    </w:lvl>
+    <w:lvl w:ilvl="2" w:tentative="1">
+      <w:start w:val="1"/>
+      <w:numFmt w:val="decimal"/>
+      <w:lvlText w:val="%3."/>
+      <w:lvlJc w:val="left"/>
+      <w:pPr>
+        <w:tabs>
+          <w:tab w:val="num" w:pos="2160"/>
+        </w:tabs>
+        <w:ind w:left="2160" w:hanging="360"/>
+      </w:pPr>
+    </w:lvl>
+    <w:lvl w:ilvl="3" w:tentative="1">
+      <w:start w:val="1"/>
+      <w:numFmt w:val="decimal"/>
+      <w:lvlText w:val="%4."/>
+      <w:lvlJc w:val="left"/>
+      <w:pPr>
+        <w:tabs>
+          <w:tab w:val="num" w:pos="2880"/>
+        </w:tabs>
+        <w:ind w:left="2880" w:hanging="360"/>
+      </w:pPr>
+    </w:lvl>
+    <w:lvl w:ilvl="4" w:tentative="1">
+      <w:start w:val="1"/>
+      <w:numFmt w:val="decimal"/>
+      <w:lvlText w:val="%5."/>
+      <w:lvlJc w:val="left"/>
+      <w:pPr>
+        <w:tabs>
+          <w:tab w:val="num" w:pos="3600"/>
+        </w:tabs>
+        <w:ind w:left="3600" w:hanging="360"/>
+      </w:pPr>
+    </w:lvl>
+    <w:lvl w:ilvl="5" w:tentative="1">
+      <w:start w:val="1"/>
+      <w:numFmt w:val="decimal"/>
+      <w:lvlText w:val="%6."/>
+      <w:lvlJc w:val="left"/>
+      <w:pPr>
+        <w:tabs>
+          <w:tab w:val="num" w:pos="4320"/>
+        </w:tabs>
+        <w:ind w:left="4320" w:hanging="360"/>
+      </w:pPr>
+    </w:lvl>
+    <w:lvl w:ilvl="6" w:tentative="1">
+      <w:start w:val="1"/>
+      <w:numFmt w:val="decimal"/>
+      <w:lvlText w:val="%7."/>
+      <w:lvlJc w:val="left"/>
+      <w:pPr>
+        <w:tabs>
+          <w:tab w:val="num" w:pos="5040"/>
+        </w:tabs>
+        <w:ind w:left="5040" w:hanging="360"/>
+      </w:pPr>
+    </w:lvl>
+    <w:lvl w:ilvl="7" w:tentative="1">
+      <w:start w:val="1"/>
+      <w:numFmt w:val="decimal"/>
+      <w:lvlText w:val="%8."/>
+      <w:lvlJc w:val="left"/>
+      <w:pPr>
+        <w:tabs>
+          <w:tab w:val="num" w:pos="5760"/>
+        </w:tabs>
+        <w:ind w:left="5760" w:hanging="360"/>
+      </w:pPr>
+    </w:lvl>
+    <w:lvl w:ilvl="8" w:tentative="1">
+      <w:start w:val="1"/>
+      <w:numFmt w:val="decimal"/>
+      <w:lvlText w:val="%9."/>
+      <w:lvlJc w:val="left"/>
+      <w:pPr>
+        <w:tabs>
+          <w:tab w:val="num" w:pos="6480"/>
+        </w:tabs>
+        <w:ind w:left="6480" w:hanging="360"/>
+      </w:pPr>
+    </w:lvl>
+  </w:abstractNum>
+  <w:num w:numId="1" w16cid:durableId="1647314906">
+    <w:abstractNumId w:val="4"/>
+  </w:num>
+  <w:num w:numId="2" w16cid:durableId="782460268">
+    <w:abstractNumId w:val="2"/>
+  </w:num>
+  <w:num w:numId="3" w16cid:durableId="1280189187">
+    <w:abstractNumId w:val="5"/>
+  </w:num>
+  <w:num w:numId="4" w16cid:durableId="630089787">
+    <w:abstractNumId w:val="10"/>
+  </w:num>
+  <w:num w:numId="5" w16cid:durableId="1308315068">
+    <w:abstractNumId w:val="13"/>
+  </w:num>
+  <w:num w:numId="6" w16cid:durableId="632950163">
+    <w:abstractNumId w:val="12"/>
+  </w:num>
+  <w:num w:numId="7" w16cid:durableId="1062412080">
+    <w:abstractNumId w:val="11"/>
+  </w:num>
+  <w:num w:numId="8" w16cid:durableId="403769584">
+    <w:abstractNumId w:val="8"/>
+  </w:num>
+  <w:num w:numId="9" w16cid:durableId="747770026">
+    <w:abstractNumId w:val="1"/>
+  </w:num>
+  <w:num w:numId="10" w16cid:durableId="840898106">
+    <w:abstractNumId w:val="0"/>
+  </w:num>
+  <w:num w:numId="11" w16cid:durableId="954140703">
+    <w:abstractNumId w:val="9"/>
+  </w:num>
+  <w:num w:numId="12" w16cid:durableId="2131971829">
+    <w:abstractNumId w:val="7"/>
+  </w:num>
+  <w:num w:numId="13" w16cid:durableId="1782873722">
+    <w:abstractNumId w:val="6"/>
+  </w:num>
+  <w:num w:numId="14" w16cid:durableId="336226506">
+    <w:abstractNumId w:val="3"/>
+  </w:num>
+</w:numbering>
 </file>
 
 <file path=word/styles.xml><?xml version="1.0" encoding="utf-8"?>
@@ -984,6 +2991,51 @@
       <w:szCs w:val="26"/>
     </w:rPr>
   </w:style>
+  <w:style w:type="paragraph" w:styleId="Ttulo3">
+    <w:name w:val="heading 3"/>
+    <w:basedOn w:val="Normal"/>
+    <w:next w:val="Normal"/>
+    <w:link w:val="Ttulo3Car"/>
+    <w:uiPriority w:val="9"/>
+    <w:semiHidden/>
+    <w:unhideWhenUsed/>
+    <w:qFormat/>
+    <w:rsid w:val="00203A3F"/>
+    <w:pPr>
+      <w:keepNext/>
+      <w:keepLines/>
+      <w:spacing w:before="40" w:after="0"/>
+      <w:outlineLvl w:val="2"/>
+    </w:pPr>
+    <w:rPr>
+      <w:rFonts w:asciiTheme="majorHAnsi" w:eastAsiaTheme="majorEastAsia" w:hAnsiTheme="majorHAnsi" w:cstheme="majorBidi"/>
+      <w:color w:val="1F3763" w:themeColor="accent1" w:themeShade="7F"/>
+      <w:szCs w:val="24"/>
+    </w:rPr>
+  </w:style>
+  <w:style w:type="paragraph" w:styleId="Ttulo4">
+    <w:name w:val="heading 4"/>
+    <w:basedOn w:val="Normal"/>
+    <w:next w:val="Normal"/>
+    <w:link w:val="Ttulo4Car"/>
+    <w:uiPriority w:val="9"/>
+    <w:semiHidden/>
+    <w:unhideWhenUsed/>
+    <w:qFormat/>
+    <w:rsid w:val="00592641"/>
+    <w:pPr>
+      <w:keepNext/>
+      <w:keepLines/>
+      <w:spacing w:before="40" w:after="0"/>
+      <w:outlineLvl w:val="3"/>
+    </w:pPr>
+    <w:rPr>
+      <w:rFonts w:asciiTheme="majorHAnsi" w:eastAsiaTheme="majorEastAsia" w:hAnsiTheme="majorHAnsi" w:cstheme="majorBidi"/>
+      <w:i/>
+      <w:iCs/>
+      <w:color w:val="2F5496" w:themeColor="accent1" w:themeShade="BF"/>
+    </w:rPr>
+  </w:style>
   <w:style w:type="character" w:default="1" w:styleId="Fuentedeprrafopredeter">
     <w:name w:val="Default Paragraph Font"/>
     <w:uiPriority w:val="1"/>
@@ -1062,125 +3114,63 @@
       <w14:ligatures w14:val="none"/>
     </w:rPr>
   </w:style>
-  <w:style w:type="table" w:styleId="Tablanormal5">
-    <w:name w:val="Plain Table 5"/>
+  <w:style w:type="character" w:customStyle="1" w:styleId="Ttulo3Car">
+    <w:name w:val="Título 3 Car"/>
+    <w:basedOn w:val="Fuentedeprrafopredeter"/>
+    <w:link w:val="Ttulo3"/>
+    <w:uiPriority w:val="9"/>
+    <w:semiHidden/>
+    <w:rsid w:val="00203A3F"/>
+    <w:rPr>
+      <w:rFonts w:asciiTheme="majorHAnsi" w:eastAsiaTheme="majorEastAsia" w:hAnsiTheme="majorHAnsi" w:cstheme="majorBidi"/>
+      <w:color w:val="1F3763" w:themeColor="accent1" w:themeShade="7F"/>
+      <w:sz w:val="24"/>
+      <w:szCs w:val="24"/>
+    </w:rPr>
+  </w:style>
+  <w:style w:type="table" w:styleId="Tablaconcuadrcula">
+    <w:name w:val="Table Grid"/>
     <w:basedOn w:val="Tablanormal"/>
-    <w:uiPriority w:val="45"/>
-    <w:rsid w:val="00D55BDA"/>
+    <w:uiPriority w:val="39"/>
+    <w:rsid w:val="00770ECD"/>
     <w:pPr>
       <w:spacing w:after="0" w:line="240" w:lineRule="auto"/>
     </w:pPr>
     <w:tblPr>
-      <w:tblStyleRowBandSize w:val="1"/>
-      <w:tblStyleColBandSize w:val="1"/>
+      <w:tblBorders>
+        <w:top w:val="single" w:sz="4" w:space="0" w:color="auto"/>
+        <w:left w:val="single" w:sz="4" w:space="0" w:color="auto"/>
+        <w:bottom w:val="single" w:sz="4" w:space="0" w:color="auto"/>
+        <w:right w:val="single" w:sz="4" w:space="0" w:color="auto"/>
+        <w:insideH w:val="single" w:sz="4" w:space="0" w:color="auto"/>
+        <w:insideV w:val="single" w:sz="4" w:space="0" w:color="auto"/>
+      </w:tblBorders>
     </w:tblPr>
-    <w:tblStylePr w:type="firstRow">
-      <w:rPr>
-        <w:rFonts w:asciiTheme="majorHAnsi" w:eastAsiaTheme="majorEastAsia" w:hAnsiTheme="majorHAnsi" w:cstheme="majorBidi"/>
-        <w:i/>
-        <w:iCs/>
-        <w:sz w:val="26"/>
-      </w:rPr>
-      <w:tblPr/>
-      <w:tcPr>
-        <w:tcBorders>
-          <w:bottom w:val="single" w:sz="4" w:space="0" w:color="7F7F7F" w:themeColor="text1" w:themeTint="80"/>
-        </w:tcBorders>
-        <w:shd w:val="clear" w:color="auto" w:fill="FFFFFF" w:themeFill="background1"/>
-      </w:tcPr>
-    </w:tblStylePr>
-    <w:tblStylePr w:type="lastRow">
-      <w:rPr>
-        <w:rFonts w:asciiTheme="majorHAnsi" w:eastAsiaTheme="majorEastAsia" w:hAnsiTheme="majorHAnsi" w:cstheme="majorBidi"/>
-        <w:i/>
-        <w:iCs/>
-        <w:sz w:val="26"/>
-      </w:rPr>
-      <w:tblPr/>
-      <w:tcPr>
-        <w:tcBorders>
-          <w:top w:val="single" w:sz="4" w:space="0" w:color="7F7F7F" w:themeColor="text1" w:themeTint="80"/>
-        </w:tcBorders>
-        <w:shd w:val="clear" w:color="auto" w:fill="FFFFFF" w:themeFill="background1"/>
-      </w:tcPr>
-    </w:tblStylePr>
-    <w:tblStylePr w:type="firstCol">
-      <w:pPr>
-        <w:jc w:val="right"/>
-      </w:pPr>
-      <w:rPr>
-        <w:rFonts w:asciiTheme="majorHAnsi" w:eastAsiaTheme="majorEastAsia" w:hAnsiTheme="majorHAnsi" w:cstheme="majorBidi"/>
-        <w:i/>
-        <w:iCs/>
-        <w:sz w:val="26"/>
-      </w:rPr>
-      <w:tblPr/>
-      <w:tcPr>
-        <w:tcBorders>
-          <w:right w:val="single" w:sz="4" w:space="0" w:color="7F7F7F" w:themeColor="text1" w:themeTint="80"/>
-        </w:tcBorders>
-        <w:shd w:val="clear" w:color="auto" w:fill="FFFFFF" w:themeFill="background1"/>
-      </w:tcPr>
-    </w:tblStylePr>
-    <w:tblStylePr w:type="lastCol">
-      <w:rPr>
-        <w:rFonts w:asciiTheme="majorHAnsi" w:eastAsiaTheme="majorEastAsia" w:hAnsiTheme="majorHAnsi" w:cstheme="majorBidi"/>
-        <w:i/>
-        <w:iCs/>
-        <w:sz w:val="26"/>
-      </w:rPr>
-      <w:tblPr/>
-      <w:tcPr>
-        <w:tcBorders>
-          <w:left w:val="single" w:sz="4" w:space="0" w:color="7F7F7F" w:themeColor="text1" w:themeTint="80"/>
-        </w:tcBorders>
-        <w:shd w:val="clear" w:color="auto" w:fill="FFFFFF" w:themeFill="background1"/>
-      </w:tcPr>
-    </w:tblStylePr>
-    <w:tblStylePr w:type="band1Vert">
-      <w:tblPr/>
-      <w:tcPr>
-        <w:shd w:val="clear" w:color="auto" w:fill="F2F2F2" w:themeFill="background1" w:themeFillShade="F2"/>
-      </w:tcPr>
-    </w:tblStylePr>
-    <w:tblStylePr w:type="band1Horz">
-      <w:tblPr/>
-      <w:tcPr>
-        <w:shd w:val="clear" w:color="auto" w:fill="F2F2F2" w:themeFill="background1" w:themeFillShade="F2"/>
-      </w:tcPr>
-    </w:tblStylePr>
-    <w:tblStylePr w:type="neCell">
-      <w:tblPr/>
-      <w:tcPr>
-        <w:tcBorders>
-          <w:left w:val="nil"/>
-        </w:tcBorders>
-      </w:tcPr>
-    </w:tblStylePr>
-    <w:tblStylePr w:type="nwCell">
-      <w:tblPr/>
-      <w:tcPr>
-        <w:tcBorders>
-          <w:right w:val="nil"/>
-        </w:tcBorders>
-      </w:tcPr>
-    </w:tblStylePr>
-    <w:tblStylePr w:type="seCell">
-      <w:tblPr/>
-      <w:tcPr>
-        <w:tcBorders>
-          <w:left w:val="nil"/>
-        </w:tcBorders>
-      </w:tcPr>
-    </w:tblStylePr>
-    <w:tblStylePr w:type="swCell">
-      <w:tblPr/>
-      <w:tcPr>
-        <w:tcBorders>
-          <w:right w:val="nil"/>
-        </w:tcBorders>
-      </w:tcPr>
-    </w:tblStylePr>
+  </w:style>
+  <w:style w:type="character" w:customStyle="1" w:styleId="Ttulo4Car">
+    <w:name w:val="Título 4 Car"/>
+    <w:basedOn w:val="Fuentedeprrafopredeter"/>
+    <w:link w:val="Ttulo4"/>
+    <w:uiPriority w:val="9"/>
+    <w:semiHidden/>
+    <w:rsid w:val="00592641"/>
+    <w:rPr>
+      <w:rFonts w:asciiTheme="majorHAnsi" w:eastAsiaTheme="majorEastAsia" w:hAnsiTheme="majorHAnsi" w:cstheme="majorBidi"/>
+      <w:i/>
+      <w:iCs/>
+      <w:color w:val="2F5496" w:themeColor="accent1" w:themeShade="BF"/>
+      <w:sz w:val="24"/>
+    </w:rPr>
+  </w:style>
+  <w:style w:type="character" w:styleId="Textodelmarcadordeposicin">
+    <w:name w:val="Placeholder Text"/>
+    <w:basedOn w:val="Fuentedeprrafopredeter"/>
+    <w:uiPriority w:val="99"/>
+    <w:semiHidden/>
+    <w:rsid w:val="00206D31"/>
+    <w:rPr>
+      <w:color w:val="666666"/>
+    </w:rPr>
   </w:style>
 </w:styles>
 </file>
@@ -1480,6 +3470,29 @@
 </a:theme>
 </file>
 
+<file path=word/webextensions/taskpanes.xml><?xml version="1.0" encoding="utf-8"?>
+<wetp:taskpanes xmlns:wetp="http://schemas.microsoft.com/office/webextensions/taskpanes/2010/11">
+  <wetp:taskpane dockstate="right" visibility="0" width="438" row="0">
+    <wetp:webextensionref xmlns:r="http://schemas.openxmlformats.org/officeDocument/2006/relationships" r:id="rId1"/>
+  </wetp:taskpane>
+</wetp:taskpanes>
+</file>
+
+<file path=word/webextensions/webextension1.xml><?xml version="1.0" encoding="utf-8"?>
+<we:webextension xmlns:we="http://schemas.microsoft.com/office/webextensions/webextension/2010/11" id="{1A151729-0008-4E69-A112-C813EABFC380}">
+  <we:reference id="wa104382081" version="1.55.1.0" store="es-ES" storeType="OMEX"/>
+  <we:alternateReferences>
+    <we:reference id="wa104382081" version="1.55.1.0" store="WA104382081" storeType="OMEX"/>
+  </we:alternateReferences>
+  <we:properties>
+    <we:property name="MENDELEY_CITATIONS" value="[{&quot;citationID&quot;:&quot;MENDELEY_CITATION_6fe06d7b-c4c2-471d-a8d7-2e68b34d53c3&quot;,&quot;properties&quot;:{&quot;noteIndex&quot;:0},&quot;isEdited&quot;:false,&quot;manualOverride&quot;:{&quot;isManuallyOverridden&quot;:false,&quot;citeprocText&quot;:&quot;[1]&quot;,&quot;manualOverrideText&quot;:&quot;&quot;},&quot;citationTag&quot;:&quot;MENDELEY_CITATION_v3_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&quot;,&quot;citationItems&quot;:[{&quot;id&quot;:&quot;9425d675-edb0-3d2d-98d6-f3e31c9ef39d&quot;,&quot;itemData&quot;:{&quot;type&quot;:&quot;article-journal&quot;,&quot;id&quot;:&quot;9425d675-edb0-3d2d-98d6-f3e31c9ef39d&quot;,&quot;title&quot;:&quot;A Stakeholder Analysis for Engagement: a PESTLE Framework for A Stakeholder Analysis for Engagement: a PESTLE Framework for the Nebraska Coalition for Patient Safety the Nebraska Coalition for Patient Safety Recommended Citation Recommended Citation \&quot;A Stakeholder Analysis for Engagement: a PESTLE Framework for the Nebraska Coalition for Patient Safety\&quot; (2025). Capstone Experience&quot;,&quot;author&quot;:[{&quot;family&quot;:&quot;Horton&quot;,&quot;given&quot;:&quot;Kaleb&quot;,&quot;parse-names&quot;:false,&quot;dropping-particle&quot;:&quot;&quot;,&quot;non-dropping-particle&quot;:&quot;&quot;}],&quot;accessed&quot;:{&quot;date-parts&quot;:[[2025,7,25]]},&quot;container-title-short&quot;:&quot;&quot;},&quot;isTemporary&quot;:false,&quot;suppress-author&quot;:false,&quot;composite&quot;:false,&quot;author-only&quot;:false}]},{&quot;citationID&quot;:&quot;MENDELEY_CITATION_9d0e2533-3ae6-4eca-acd4-fd854254fde3&quot;,&quot;properties&quot;:{&quot;noteIndex&quot;:0},&quot;isEdited&quot;:false,&quot;manualOverride&quot;:{&quot;isManuallyOverridden&quot;:false,&quot;citeprocText&quot;:&quot;[2]&quot;,&quot;manualOverrideText&quot;:&quot;&quot;},&quot;citationTag&quot;:&quot;MENDELEY_CITATION_v3_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&quot;,&quot;citationItems&quot;:[{&quot;id&quot;:&quot;f4f741b9-16c8-3854-a3e0-aea06ae45052&quot;,&quot;itemData&quot;:{&quot;type&quot;:&quot;article-journal&quot;,&quot;id&quot;:&quot;f4f741b9-16c8-3854-a3e0-aea06ae45052&quot;,&quot;title&quot;:&quot;PESTEL ANALYSIS FOR SMALL BUSINESSES WHAT IS A PESTEL ANALYSIS?&quot;,&quot;accessed&quot;:{&quot;date-parts&quot;:[[2025,7,25]]},&quot;container-title-short&quot;:&quot;&quot;},&quot;isTemporary&quot;:false,&quot;suppress-author&quot;:false,&quot;composite&quot;:false,&quot;author-only&quot;:false}]}]"/>
+    <we:property name="MENDELEY_CITATIONS_STYLE" value="{&quot;id&quot;:&quot;https://www.zotero.org/styles/ieee&quot;,&quot;title&quot;:&quot;IEEE&quot;,&quot;format&quot;:&quot;numeric&quot;,&quot;defaultLocale&quot;:null,&quot;isLocaleCodeValid&quot;:true}"/>
+  </we:properties>
+  <we:bindings/>
+  <we:snapshot xmlns:r="http://schemas.openxmlformats.org/officeDocument/2006/relationships"/>
+</we:webextension>
+</file>
+
 <file path=customXml/item1.xml><?xml version="1.0" encoding="utf-8"?>
 <ct:contentTypeSchema xmlns:ct="http://schemas.microsoft.com/office/2006/metadata/contentType" xmlns:ma="http://schemas.microsoft.com/office/2006/metadata/properties/metaAttributes" ct:_="" ma:_="" ma:contentTypeName="Documento" ma:contentTypeID="0x010100A5C0487A85234041ABCC04D606B0D680" ma:contentTypeVersion="13" ma:contentTypeDescription="Crear nuevo documento." ma:contentTypeScope="" ma:versionID="6cfa88a6c60d194070a270eb62a21b24">
   <xsd:schema xmlns:xsd="http://www.w3.org/2001/XMLSchema" xmlns:xs="http://www.w3.org/2001/XMLSchema" xmlns:p="http://schemas.microsoft.com/office/2006/metadata/properties" xmlns:ns3="412e5359-321c-4749-b6c6-497cf934ab24" targetNamespace="http://schemas.microsoft.com/office/2006/metadata/properties" ma:root="true" ma:fieldsID="395a25b24f05dd036ecc9c98436a574a" ns3:_="">
@@ -1683,7 +3696,12 @@
 </file>
 
 <file path=customXml/item2.xml><?xml version="1.0" encoding="utf-8"?>
-<b:Sources xmlns:b="http://schemas.openxmlformats.org/officeDocument/2006/bibliography" xmlns="http://schemas.openxmlformats.org/officeDocument/2006/bibliography" SelectedStyle="\APASixthEditionOfficeOnline.xsl" StyleName="APA" Version="6"/>
+<?mso-contentType ?>
+<FormTemplates xmlns="http://schemas.microsoft.com/sharepoint/v3/contenttype/forms">
+  <Display>DocumentLibraryForm</Display>
+  <Edit>DocumentLibraryForm</Edit>
+  <New>DocumentLibraryForm</New>
+</FormTemplates>
 </file>
 
 <file path=customXml/item3.xml><?xml version="1.0" encoding="utf-8"?>
@@ -1693,12 +3711,7 @@
 </file>
 
 <file path=customXml/item4.xml><?xml version="1.0" encoding="utf-8"?>
-<?mso-contentType ?>
-<FormTemplates xmlns="http://schemas.microsoft.com/sharepoint/v3/contenttype/forms">
-  <Display>DocumentLibraryForm</Display>
-  <Edit>DocumentLibraryForm</Edit>
-  <New>DocumentLibraryForm</New>
-</FormTemplates>
+<b:Sources xmlns:b="http://schemas.openxmlformats.org/officeDocument/2006/bibliography" xmlns="http://schemas.openxmlformats.org/officeDocument/2006/bibliography" SelectedStyle="\APASixthEditionOfficeOnline.xsl" StyleName="APA" Version="6"/>
 </file>
 
 <file path=customXml/itemProps1.xml><?xml version="1.0" encoding="utf-8"?>
@@ -1720,9 +3733,9 @@
 </file>
 
 <file path=customXml/itemProps2.xml><?xml version="1.0" encoding="utf-8"?>
-<ds:datastoreItem xmlns:ds="http://schemas.openxmlformats.org/officeDocument/2006/customXml" ds:itemID="{08F8AE20-8A1E-411A-B97B-F8C6621176DC}">
+<ds:datastoreItem xmlns:ds="http://schemas.openxmlformats.org/officeDocument/2006/customXml" ds:itemID="{85BFE6E4-4CB5-4366-AD67-3CEFCBC6D1DB}">
   <ds:schemaRefs>
-    <ds:schemaRef ds:uri="http://schemas.openxmlformats.org/officeDocument/2006/bibliography"/>
+    <ds:schemaRef ds:uri="http://schemas.microsoft.com/sharepoint/v3/contenttype/forms"/>
   </ds:schemaRefs>
 </ds:datastoreItem>
 </file>
@@ -1737,9 +3750,9 @@
 </file>
 
 <file path=customXml/itemProps4.xml><?xml version="1.0" encoding="utf-8"?>
-<ds:datastoreItem xmlns:ds="http://schemas.openxmlformats.org/officeDocument/2006/customXml" ds:itemID="{85BFE6E4-4CB5-4366-AD67-3CEFCBC6D1DB}">
+<ds:datastoreItem xmlns:ds="http://schemas.openxmlformats.org/officeDocument/2006/customXml" ds:itemID="{08F8AE20-8A1E-411A-B97B-F8C6621176DC}">
   <ds:schemaRefs>
-    <ds:schemaRef ds:uri="http://schemas.microsoft.com/sharepoint/v3/contenttype/forms"/>
+    <ds:schemaRef ds:uri="http://schemas.openxmlformats.org/officeDocument/2006/bibliography"/>
   </ds:schemaRefs>
 </ds:datastoreItem>
 </file>
</xml_diff>